<commit_message>
feat: Bluetooth: - Achieved stable communication and refined the 38-byte transmission protocol. - Aligned data packet handling with FrameChunk specifications for reliable streaming.
Drawing:
- Optimized the Python drawing script for multiple patterns and animation effects.
- Added support for Hanzi (Chinese character) display on the $16 \times 16$ matrix.

Co-authored-by: Copilot <copilot@github.com>
</commit_message>
<xml_diff>
--- a/Doc/毕业论文/毕业论文模板.docx
+++ b/Doc/毕业论文/毕业论文模板.docx
@@ -1,6 +1,6 @@
 
 <file path=word/document.xml><?xml version="1.0" encoding="utf-8"?>
-<w:document xmlns:wpc="http://schemas.microsoft.com/office/word/2010/wordprocessingCanvas" xmlns:cx="http://schemas.microsoft.com/office/drawing/2014/chartex" xmlns:mc="http://schemas.openxmlformats.org/markup-compatibility/2006" xmlns:o="urn:schemas-microsoft-com:office:office" xmlns:r="http://schemas.openxmlformats.org/officeDocument/2006/relationships" xmlns:m="http://schemas.openxmlformats.org/officeDocument/2006/math" xmlns:v="urn:schemas-microsoft-com:vml" xmlns:wp14="http://schemas.microsoft.com/office/word/2010/wordprocessingDrawing" xmlns:wp="http://schemas.openxmlformats.org/drawingml/2006/wordprocessingDrawing" xmlns:w10="urn:schemas-microsoft-com:office:word" xmlns:w="http://schemas.openxmlformats.org/wordprocessingml/2006/main" xmlns:w14="http://schemas.microsoft.com/office/word/2010/wordml" xmlns:w15="http://schemas.microsoft.com/office/word/2012/wordml" xmlns:w16se="http://schemas.microsoft.com/office/word/2015/wordml/symex" xmlns:wpg="http://schemas.microsoft.com/office/word/2010/wordprocessingGroup" xmlns:wpi="http://schemas.microsoft.com/office/word/2010/wordprocessingInk" xmlns:wne="http://schemas.microsoft.com/office/word/2006/wordml" xmlns:wps="http://schemas.microsoft.com/office/word/2010/wordprocessingShape" mc:Ignorable="w14 w15 w16se wp14">
+<w:document xmlns:wpc="http://schemas.microsoft.com/office/word/2010/wordprocessingCanvas" xmlns:cx="http://schemas.microsoft.com/office/drawing/2014/chartex" xmlns:cx1="http://schemas.microsoft.com/office/drawing/2015/9/8/chartex" xmlns:cx2="http://schemas.microsoft.com/office/drawing/2015/10/21/chartex" xmlns:cx3="http://schemas.microsoft.com/office/drawing/2016/5/9/chartex" xmlns:cx4="http://schemas.microsoft.com/office/drawing/2016/5/10/chartex" xmlns:cx5="http://schemas.microsoft.com/office/drawing/2016/5/11/chartex" xmlns:cx6="http://schemas.microsoft.com/office/drawing/2016/5/12/chartex" xmlns:cx7="http://schemas.microsoft.com/office/drawing/2016/5/13/chartex" xmlns:cx8="http://schemas.microsoft.com/office/drawing/2016/5/14/chartex" xmlns:mc="http://schemas.openxmlformats.org/markup-compatibility/2006" xmlns:aink="http://schemas.microsoft.com/office/drawing/2016/ink" xmlns:am3d="http://schemas.microsoft.com/office/drawing/2017/model3d" xmlns:o="urn:schemas-microsoft-com:office:office" xmlns:oel="http://schemas.microsoft.com/office/2019/extlst" xmlns:r="http://schemas.openxmlformats.org/officeDocument/2006/relationships" xmlns:m="http://schemas.openxmlformats.org/officeDocument/2006/math" xmlns:v="urn:schemas-microsoft-com:vml" xmlns:wp14="http://schemas.microsoft.com/office/word/2010/wordprocessingDrawing" xmlns:wp="http://schemas.openxmlformats.org/drawingml/2006/wordprocessingDrawing" xmlns:w10="urn:schemas-microsoft-com:office:word" xmlns:w="http://schemas.openxmlformats.org/wordprocessingml/2006/main" xmlns:w14="http://schemas.microsoft.com/office/word/2010/wordml" xmlns:w15="http://schemas.microsoft.com/office/word/2012/wordml" xmlns:w16cex="http://schemas.microsoft.com/office/word/2018/wordml/cex" xmlns:w16cid="http://schemas.microsoft.com/office/word/2016/wordml/cid" xmlns:w16="http://schemas.microsoft.com/office/word/2018/wordml" xmlns:w16du="http://schemas.microsoft.com/office/word/2023/wordml/word16du" xmlns:w16sdtdh="http://schemas.microsoft.com/office/word/2020/wordml/sdtdatahash" xmlns:w16sdtfl="http://schemas.microsoft.com/office/word/2024/wordml/sdtformatlock" xmlns:w16se="http://schemas.microsoft.com/office/word/2015/wordml/symex" xmlns:wpg="http://schemas.microsoft.com/office/word/2010/wordprocessingGroup" xmlns:wpi="http://schemas.microsoft.com/office/word/2010/wordprocessingInk" xmlns:wne="http://schemas.microsoft.com/office/word/2006/wordml" xmlns:wps="http://schemas.microsoft.com/office/word/2010/wordprocessingShape" mc:Ignorable="w14 w15 w16se w16cid w16 w16cex w16sdtdh w16sdtfl w16du wp14">
   <w:body>
     <w:p>
       <w:pPr>
@@ -20,7 +20,7 @@
           <w:szCs w:val="15"/>
         </w:rPr>
         <w:drawing>
-          <wp:inline distT="0" distB="0" distL="0" distR="0">
+          <wp:inline distT="0" distB="0" distL="0" distR="0" wp14:anchorId="5635887B" wp14:editId="5EC1C474">
             <wp:extent cx="4765040" cy="1116330"/>
             <wp:effectExtent l="0" t="0" r="0" b="7620"/>
             <wp:docPr id="1" name="图片 1" descr="毕业论文标2"/>
@@ -136,7 +136,6 @@
       <w:pPr>
         <w:jc w:val="left"/>
         <w:rPr>
-          <w:rFonts w:hint="eastAsia"/>
           <w:sz w:val="18"/>
           <w:szCs w:val="18"/>
         </w:rPr>
@@ -146,7 +145,6 @@
       <w:pPr>
         <w:jc w:val="center"/>
         <w:rPr>
-          <w:rFonts w:hint="eastAsia"/>
           <w:b/>
           <w:sz w:val="72"/>
           <w:szCs w:val="72"/>
@@ -230,15 +228,16 @@
           <w:szCs w:val="32"/>
           <w:u w:val="single"/>
         </w:rPr>
-        <w:t xml:space="preserve">   </w:t>
-      </w:r>
-      <w:r>
-        <w:rPr>
+        <w:t xml:space="preserve">  </w:t>
+      </w:r>
+      <w:r>
+        <w:rPr>
+          <w:rFonts w:hint="eastAsia"/>
           <w:sz w:val="32"/>
           <w:szCs w:val="32"/>
           <w:u w:val="single"/>
         </w:rPr>
-        <w:t xml:space="preserve">                                   </w:t>
+        <w:t>基于</w:t>
       </w:r>
       <w:r>
         <w:rPr>
@@ -247,14 +246,58 @@
           <w:szCs w:val="32"/>
           <w:u w:val="single"/>
         </w:rPr>
-        <w:t xml:space="preserve"> </w:t>
-      </w:r>
-      <w:r>
-        <w:rPr>
+        <w:t>MCU</w:t>
+      </w:r>
+      <w:r>
+        <w:rPr>
+          <w:rFonts w:hint="eastAsia"/>
           <w:sz w:val="32"/>
           <w:szCs w:val="32"/>
           <w:u w:val="single"/>
         </w:rPr>
+        <w:t>的智能</w:t>
+      </w:r>
+      <w:r>
+        <w:rPr>
+          <w:rFonts w:hint="eastAsia"/>
+          <w:sz w:val="32"/>
+          <w:szCs w:val="32"/>
+          <w:u w:val="single"/>
+        </w:rPr>
+        <w:t>LED</w:t>
+      </w:r>
+      <w:r>
+        <w:rPr>
+          <w:rFonts w:hint="eastAsia"/>
+          <w:sz w:val="32"/>
+          <w:szCs w:val="32"/>
+          <w:u w:val="single"/>
+        </w:rPr>
+        <w:t>图示条幅的设计</w:t>
+      </w:r>
+      <w:r>
+        <w:rPr>
+          <w:sz w:val="32"/>
+          <w:szCs w:val="32"/>
+          <w:u w:val="single"/>
+        </w:rPr>
+        <w:t xml:space="preserve">  </w:t>
+      </w:r>
+      <w:r>
+        <w:rPr>
+          <w:rFonts w:hint="eastAsia"/>
+          <w:sz w:val="32"/>
+          <w:szCs w:val="32"/>
+          <w:u w:val="single"/>
+        </w:rPr>
+        <w:t xml:space="preserve"> </w:t>
+      </w:r>
+      <w:r>
+        <w:rPr>
+          <w:sz w:val="32"/>
+          <w:szCs w:val="32"/>
+          <w:u w:val="single"/>
+        </w:rPr>
         <w:t xml:space="preserve"> </w:t>
       </w:r>
     </w:p>
@@ -263,7 +306,6 @@
         <w:spacing w:line="360" w:lineRule="auto"/>
         <w:ind w:rightChars="359" w:right="754" w:firstLineChars="638" w:firstLine="2042"/>
         <w:rPr>
-          <w:rFonts w:hint="eastAsia"/>
           <w:b/>
           <w:sz w:val="32"/>
           <w:szCs w:val="32"/>
@@ -330,27 +372,24 @@
           <w:szCs w:val="32"/>
           <w:u w:val="single"/>
         </w:rPr>
-        <w:t xml:space="preserve">                                       </w:t>
-      </w:r>
-    </w:p>
-    <w:p>
-      <w:pPr>
-        <w:spacing w:line="360" w:lineRule="auto"/>
-        <w:ind w:rightChars="359" w:right="754" w:firstLineChars="638" w:firstLine="2042"/>
+        <w:t xml:space="preserve"> </w:t>
+      </w:r>
+      <w:r>
         <w:rPr>
           <w:rFonts w:hint="eastAsia"/>
           <w:sz w:val="32"/>
           <w:szCs w:val="32"/>
           <w:u w:val="single"/>
         </w:rPr>
-      </w:pPr>
+        <w:t>Design of an Intelligent LED</w:t>
+      </w:r>
       <w:r>
         <w:rPr>
           <w:sz w:val="32"/>
           <w:szCs w:val="32"/>
           <w:u w:val="single"/>
         </w:rPr>
-        <w:t xml:space="preserve">             </w:t>
+        <w:t xml:space="preserve"> </w:t>
       </w:r>
       <w:r>
         <w:rPr>
@@ -359,7 +398,7 @@
           <w:szCs w:val="32"/>
           <w:u w:val="single"/>
         </w:rPr>
-        <w:t xml:space="preserve">                          </w:t>
+        <w:t>Graphic Banner</w:t>
       </w:r>
       <w:r>
         <w:rPr>
@@ -367,6 +406,59 @@
           <w:szCs w:val="32"/>
           <w:u w:val="single"/>
         </w:rPr>
+        <w:t xml:space="preserve">  </w:t>
+      </w:r>
+    </w:p>
+    <w:p>
+      <w:pPr>
+        <w:spacing w:line="360" w:lineRule="auto"/>
+        <w:ind w:rightChars="359" w:right="754" w:firstLineChars="638" w:firstLine="2042"/>
+        <w:rPr>
+          <w:sz w:val="32"/>
+          <w:szCs w:val="32"/>
+          <w:u w:val="single"/>
+        </w:rPr>
+      </w:pPr>
+      <w:r>
+        <w:rPr>
+          <w:sz w:val="32"/>
+          <w:szCs w:val="32"/>
+          <w:u w:val="single"/>
+        </w:rPr>
+        <w:t xml:space="preserve">  </w:t>
+      </w:r>
+      <w:r>
+        <w:rPr>
+          <w:rFonts w:hint="eastAsia"/>
+          <w:sz w:val="32"/>
+          <w:szCs w:val="32"/>
+          <w:u w:val="single"/>
+        </w:rPr>
+        <w:t>Based on MCU</w:t>
+      </w:r>
+      <w:r>
+        <w:rPr>
+          <w:sz w:val="32"/>
+          <w:szCs w:val="32"/>
+          <w:u w:val="single"/>
+        </w:rPr>
+        <w:t xml:space="preserve">           </w:t>
+      </w:r>
+      <w:r>
+        <w:rPr>
+          <w:rFonts w:hint="eastAsia"/>
+          <w:sz w:val="32"/>
+          <w:szCs w:val="32"/>
+          <w:u w:val="single"/>
+        </w:rPr>
+        <w:t xml:space="preserve">                          </w:t>
+      </w:r>
+      <w:r>
+        <w:rPr>
+          <w:sz w:val="32"/>
+          <w:szCs w:val="32"/>
+          <w:u w:val="single"/>
+        </w:rPr>
         <w:t xml:space="preserve"> </w:t>
       </w:r>
     </w:p>
@@ -403,7 +495,6 @@
       <w:pPr>
         <w:ind w:rightChars="250" w:right="525"/>
         <w:rPr>
-          <w:rFonts w:hint="eastAsia"/>
           <w:b/>
           <w:sz w:val="32"/>
           <w:szCs w:val="32"/>
@@ -425,7 +516,6 @@
         <w:spacing w:line="360" w:lineRule="auto"/>
         <w:ind w:rightChars="359" w:right="754" w:firstLineChars="231" w:firstLine="742"/>
         <w:rPr>
-          <w:rFonts w:hint="eastAsia"/>
           <w:b/>
           <w:sz w:val="32"/>
           <w:szCs w:val="32"/>
@@ -455,7 +545,7 @@
           <w:szCs w:val="32"/>
           <w:u w:val="single"/>
         </w:rPr>
-        <w:t xml:space="preserve">                </w:t>
+        <w:t xml:space="preserve">             </w:t>
       </w:r>
       <w:r>
         <w:rPr>
@@ -464,14 +554,23 @@
           <w:szCs w:val="32"/>
           <w:u w:val="single"/>
         </w:rPr>
-        <w:t>XXX</w:t>
-      </w:r>
-      <w:r>
-        <w:rPr>
+        <w:t xml:space="preserve"> </w:t>
+      </w:r>
+      <w:r>
+        <w:rPr>
+          <w:rFonts w:hint="eastAsia"/>
           <w:sz w:val="32"/>
           <w:szCs w:val="32"/>
           <w:u w:val="single"/>
         </w:rPr>
+        <w:t>聂俊宇</w:t>
+      </w:r>
+      <w:r>
+        <w:rPr>
+          <w:sz w:val="32"/>
+          <w:szCs w:val="32"/>
+          <w:u w:val="single"/>
+        </w:rPr>
         <w:t xml:space="preserve">                          </w:t>
       </w:r>
     </w:p>
@@ -480,7 +579,6 @@
         <w:spacing w:line="360" w:lineRule="auto"/>
         <w:ind w:rightChars="359" w:right="754" w:firstLineChars="231" w:firstLine="742"/>
         <w:rPr>
-          <w:rFonts w:hint="eastAsia"/>
           <w:b/>
           <w:sz w:val="32"/>
           <w:szCs w:val="32"/>
@@ -537,7 +635,24 @@
           <w:szCs w:val="32"/>
           <w:u w:val="single"/>
         </w:rPr>
-        <w:t xml:space="preserve">             1918XXXX                           </w:t>
+        <w:t xml:space="preserve">             </w:t>
+      </w:r>
+      <w:r>
+        <w:rPr>
+          <w:rFonts w:hint="eastAsia"/>
+          <w:sz w:val="32"/>
+          <w:szCs w:val="32"/>
+          <w:u w:val="single"/>
+        </w:rPr>
+        <w:t>19220309</w:t>
+      </w:r>
+      <w:r>
+        <w:rPr>
+          <w:sz w:val="32"/>
+          <w:szCs w:val="32"/>
+          <w:u w:val="single"/>
+        </w:rPr>
+        <w:t xml:space="preserve">                           </w:t>
       </w:r>
     </w:p>
     <w:p>
@@ -545,7 +660,6 @@
         <w:spacing w:line="360" w:lineRule="auto"/>
         <w:ind w:rightChars="359" w:right="754" w:firstLineChars="231" w:firstLine="742"/>
         <w:rPr>
-          <w:rFonts w:hint="eastAsia"/>
           <w:b/>
           <w:sz w:val="32"/>
           <w:szCs w:val="32"/>
@@ -696,15 +810,16 @@
           <w:szCs w:val="32"/>
           <w:u w:val="single"/>
         </w:rPr>
-        <w:t>微电子科学与工程</w:t>
-      </w:r>
-      <w:r>
-        <w:rPr>
+        <w:t xml:space="preserve">  </w:t>
+      </w:r>
+      <w:r>
+        <w:rPr>
+          <w:rFonts w:hint="eastAsia"/>
           <w:sz w:val="32"/>
           <w:szCs w:val="32"/>
           <w:u w:val="single"/>
         </w:rPr>
-        <w:t xml:space="preserve">                      </w:t>
+        <w:t>电子信息</w:t>
       </w:r>
       <w:r>
         <w:rPr>
@@ -713,6 +828,23 @@
           <w:szCs w:val="32"/>
           <w:u w:val="single"/>
         </w:rPr>
+        <w:t>工程</w:t>
+      </w:r>
+      <w:r>
+        <w:rPr>
+          <w:sz w:val="32"/>
+          <w:szCs w:val="32"/>
+          <w:u w:val="single"/>
+        </w:rPr>
+        <w:t xml:space="preserve">                      </w:t>
+      </w:r>
+      <w:r>
+        <w:rPr>
+          <w:rFonts w:hint="eastAsia"/>
+          <w:sz w:val="32"/>
+          <w:szCs w:val="32"/>
+          <w:u w:val="single"/>
+        </w:rPr>
         <w:t xml:space="preserve">               </w:t>
       </w:r>
     </w:p>
@@ -721,7 +853,6 @@
         <w:spacing w:line="360" w:lineRule="auto"/>
         <w:ind w:rightChars="359" w:right="754" w:firstLineChars="231" w:firstLine="742"/>
         <w:rPr>
-          <w:rFonts w:hint="eastAsia"/>
           <w:b/>
           <w:sz w:val="72"/>
           <w:szCs w:val="72"/>
@@ -756,11 +887,12 @@
       </w:r>
       <w:r>
         <w:rPr>
+          <w:rFonts w:hint="eastAsia"/>
           <w:sz w:val="32"/>
           <w:szCs w:val="32"/>
           <w:u w:val="single"/>
         </w:rPr>
-        <w:t xml:space="preserve"> </w:t>
+        <w:t>李秀英</w:t>
       </w:r>
       <w:r>
         <w:rPr>
@@ -777,15 +909,16 @@
           <w:szCs w:val="32"/>
           <w:u w:val="single"/>
         </w:rPr>
-        <w:t>XXX</w:t>
-      </w:r>
-      <w:r>
-        <w:rPr>
+        <w:t>副</w:t>
+      </w:r>
+      <w:r>
+        <w:rPr>
+          <w:rFonts w:hint="eastAsia"/>
           <w:sz w:val="32"/>
           <w:szCs w:val="32"/>
           <w:u w:val="single"/>
         </w:rPr>
-        <w:t xml:space="preserve"> </w:t>
+        <w:t>教授</w:t>
       </w:r>
       <w:r>
         <w:rPr>
@@ -794,32 +927,23 @@
           <w:szCs w:val="32"/>
           <w:u w:val="single"/>
         </w:rPr>
-        <w:t>教授</w:t>
-      </w:r>
-      <w:r>
-        <w:rPr>
-          <w:rFonts w:hint="eastAsia"/>
+        <w:t xml:space="preserve">       </w:t>
+      </w:r>
+      <w:r>
+        <w:rPr>
           <w:sz w:val="32"/>
           <w:szCs w:val="32"/>
           <w:u w:val="single"/>
         </w:rPr>
-        <w:t xml:space="preserve">       </w:t>
-      </w:r>
-      <w:r>
-        <w:rPr>
+        <w:t xml:space="preserve">              </w:t>
+      </w:r>
+      <w:r>
+        <w:rPr>
+          <w:rFonts w:hint="eastAsia"/>
           <w:sz w:val="32"/>
           <w:szCs w:val="32"/>
           <w:u w:val="single"/>
         </w:rPr>
-        <w:t xml:space="preserve">              </w:t>
-      </w:r>
-      <w:r>
-        <w:rPr>
-          <w:rFonts w:hint="eastAsia"/>
-          <w:sz w:val="32"/>
-          <w:szCs w:val="32"/>
-          <w:u w:val="single"/>
-        </w:rPr>
         <w:t xml:space="preserve">   </w:t>
       </w:r>
     </w:p>
@@ -839,7 +963,6 @@
         <w:spacing w:beforeLines="50" w:before="120"/>
         <w:ind w:rightChars="250" w:right="525"/>
         <w:rPr>
-          <w:rFonts w:hint="eastAsia"/>
           <w:b/>
           <w:sz w:val="32"/>
           <w:szCs w:val="32"/>
@@ -914,7 +1037,7 @@
         <w:spacing w:beforeLines="50" w:before="120" w:line="360" w:lineRule="auto"/>
         <w:jc w:val="center"/>
         <w:rPr>
-          <w:rFonts w:ascii="黑体" w:eastAsia="黑体" w:hAnsi="黑体"/>
+          <w:rFonts w:ascii="黑体" w:eastAsia="黑体" w:hAnsi="黑体" w:hint="eastAsia"/>
           <w:sz w:val="32"/>
           <w:szCs w:val="32"/>
         </w:rPr>
@@ -947,62 +1070,6 @@
         </w:rPr>
         <w:t xml:space="preserve"> 要</w:t>
       </w:r>
-      <w:r>
-        <w:rPr>
-          <w:rFonts w:ascii="宋体" w:hAnsi="宋体" w:hint="eastAsia"/>
-          <w:sz w:val="30"/>
-          <w:szCs w:val="30"/>
-        </w:rPr>
-        <w:t>(</w:t>
-      </w:r>
-      <w:r>
-        <w:rPr>
-          <w:rFonts w:ascii="宋体" w:hAnsi="宋体" w:hint="eastAsia"/>
-          <w:sz w:val="30"/>
-          <w:szCs w:val="30"/>
-        </w:rPr>
-        <w:t>宋</w:t>
-      </w:r>
-      <w:r>
-        <w:rPr>
-          <w:rFonts w:ascii="宋体" w:hAnsi="宋体" w:hint="eastAsia"/>
-          <w:sz w:val="30"/>
-          <w:szCs w:val="30"/>
-        </w:rPr>
-        <w:t>体</w:t>
-      </w:r>
-      <w:r>
-        <w:rPr>
-          <w:rFonts w:ascii="宋体" w:hAnsi="宋体" w:hint="eastAsia"/>
-          <w:sz w:val="30"/>
-          <w:szCs w:val="30"/>
-        </w:rPr>
-        <w:t>加黑</w:t>
-      </w:r>
-      <w:r>
-        <w:rPr>
-          <w:rFonts w:ascii="宋体" w:hAnsi="宋体" w:hint="eastAsia"/>
-          <w:sz w:val="30"/>
-          <w:szCs w:val="30"/>
-        </w:rPr>
-        <w:t>，</w:t>
-      </w:r>
-      <w:r>
-        <w:rPr>
-          <w:rFonts w:ascii="宋体" w:hAnsi="宋体" w:hint="eastAsia"/>
-          <w:sz w:val="30"/>
-          <w:szCs w:val="30"/>
-        </w:rPr>
-        <w:t>小</w:t>
-      </w:r>
-      <w:r>
-        <w:rPr>
-          <w:rFonts w:ascii="宋体" w:hAnsi="宋体" w:hint="eastAsia"/>
-          <w:sz w:val="30"/>
-          <w:szCs w:val="30"/>
-        </w:rPr>
-        <w:t>三号字，居中)</w:t>
-      </w:r>
     </w:p>
     <w:p>
       <w:pPr>
@@ -1018,122 +1085,7 @@
           <w:rFonts w:hint="eastAsia"/>
           <w:sz w:val="24"/>
         </w:rPr>
-        <w:t>摘要的内容是毕业论文的内容提要。摘要的正文部分，</w:t>
-      </w:r>
-      <w:r>
-        <w:rPr>
-          <w:rFonts w:hint="eastAsia"/>
-          <w:sz w:val="24"/>
-        </w:rPr>
-        <w:t>中文</w:t>
-      </w:r>
-      <w:r>
-        <w:rPr>
-          <w:rFonts w:hint="eastAsia"/>
-          <w:sz w:val="24"/>
-        </w:rPr>
-        <w:t>字体为宋体，</w:t>
-      </w:r>
-      <w:r>
-        <w:rPr>
-          <w:rFonts w:hint="eastAsia"/>
-          <w:sz w:val="24"/>
-        </w:rPr>
-        <w:t>英文字体为</w:t>
-      </w:r>
-      <w:r>
-        <w:rPr>
-          <w:rFonts w:hint="eastAsia"/>
-          <w:sz w:val="24"/>
-        </w:rPr>
-        <w:t>Time</w:t>
-      </w:r>
-      <w:r>
-        <w:rPr>
-          <w:sz w:val="24"/>
-        </w:rPr>
-        <w:t xml:space="preserve"> New </w:t>
-      </w:r>
-      <w:r>
-        <w:rPr>
-          <w:rFonts w:hint="eastAsia"/>
-          <w:sz w:val="24"/>
-        </w:rPr>
-        <w:t>Roman</w:t>
-      </w:r>
-      <w:r>
-        <w:rPr>
-          <w:rFonts w:hint="eastAsia"/>
-          <w:sz w:val="24"/>
-        </w:rPr>
-        <w:t>，</w:t>
-      </w:r>
-      <w:r>
-        <w:rPr>
-          <w:rFonts w:hint="eastAsia"/>
-          <w:sz w:val="24"/>
-        </w:rPr>
-        <w:t>字号为小四号字，或者</w:t>
-      </w:r>
-      <w:r>
-        <w:rPr>
-          <w:rFonts w:hint="eastAsia"/>
-          <w:sz w:val="24"/>
-        </w:rPr>
-        <w:t>1</w:t>
-      </w:r>
-      <w:r>
-        <w:rPr>
-          <w:sz w:val="24"/>
-        </w:rPr>
-        <w:t>2</w:t>
-      </w:r>
-      <w:r>
-        <w:rPr>
-          <w:rFonts w:hint="eastAsia"/>
-          <w:sz w:val="24"/>
-        </w:rPr>
-        <w:t>号字</w:t>
-      </w:r>
-      <w:r>
-        <w:rPr>
-          <w:rFonts w:hint="eastAsia"/>
-          <w:sz w:val="24"/>
-        </w:rPr>
-        <w:t>，</w:t>
-      </w:r>
-      <w:r>
-        <w:rPr>
-          <w:rFonts w:hint="eastAsia"/>
-          <w:sz w:val="24"/>
-        </w:rPr>
-        <w:t>1</w:t>
-      </w:r>
-      <w:r>
-        <w:rPr>
-          <w:sz w:val="24"/>
-        </w:rPr>
-        <w:t>.5</w:t>
-      </w:r>
-      <w:r>
-        <w:rPr>
-          <w:rFonts w:hint="eastAsia"/>
-          <w:sz w:val="24"/>
-        </w:rPr>
-        <w:t>倍行间距，段前为</w:t>
-      </w:r>
-      <w:r>
-        <w:rPr>
-          <w:sz w:val="24"/>
-        </w:rPr>
-        <w:t>0.5</w:t>
-      </w:r>
-      <w:r>
-        <w:rPr>
-          <w:rFonts w:hint="eastAsia"/>
-          <w:sz w:val="24"/>
-        </w:rPr>
-        <w:t>倍行距。</w:t>
+        <w:t>。</w:t>
       </w:r>
     </w:p>
     <w:p>
@@ -1209,7 +1161,6 @@
         <w:spacing w:before="50" w:line="360" w:lineRule="auto"/>
         <w:ind w:firstLineChars="177" w:firstLine="425"/>
         <w:rPr>
-          <w:rFonts w:hint="eastAsia"/>
           <w:sz w:val="24"/>
         </w:rPr>
       </w:pPr>
@@ -1219,7 +1170,7 @@
         <w:snapToGrid w:val="0"/>
         <w:spacing w:before="50" w:line="360" w:lineRule="auto"/>
         <w:rPr>
-          <w:rFonts w:ascii="宋体" w:hAnsi="宋体"/>
+          <w:rFonts w:ascii="宋体" w:hAnsi="宋体" w:hint="eastAsia"/>
           <w:b/>
           <w:sz w:val="24"/>
         </w:rPr>
@@ -1652,7 +1603,10 @@
     </w:p>
     <w:p>
       <w:pPr>
-        <w:pStyle w:val="11"/>
+        <w:pStyle w:val="TOC1"/>
+        <w:rPr>
+          <w:rFonts w:hint="eastAsia"/>
+        </w:rPr>
       </w:pPr>
       <w:r>
         <w:rPr>
@@ -1673,7 +1627,7 @@
     </w:p>
     <w:p>
       <w:pPr>
-        <w:pStyle w:val="11"/>
+        <w:pStyle w:val="TOC1"/>
         <w:spacing w:before="0" w:after="0" w:line="360" w:lineRule="auto"/>
         <w:rPr>
           <w:rFonts w:ascii="Times New Roman" w:eastAsia="宋体" w:hAnsi="Times New Roman" w:cstheme="minorBidi"/>
@@ -1837,12 +1791,12 @@
     </w:p>
     <w:p>
       <w:pPr>
-        <w:pStyle w:val="21"/>
+        <w:pStyle w:val="TOC2"/>
         <w:tabs>
           <w:tab w:val="right" w:leader="dot" w:pos="8920"/>
         </w:tabs>
         <w:spacing w:line="360" w:lineRule="auto"/>
-        <w:ind w:left="0" w:firstLineChars="100" w:firstLine="280"/>
+        <w:ind w:left="0" w:firstLineChars="100" w:firstLine="200"/>
         <w:rPr>
           <w:rFonts w:ascii="Times New Roman" w:eastAsia="宋体" w:cstheme="minorBidi"/>
           <w:smallCaps w:val="0"/>
@@ -1945,12 +1899,12 @@
     </w:p>
     <w:p>
       <w:pPr>
-        <w:pStyle w:val="31"/>
+        <w:pStyle w:val="TOC3"/>
         <w:tabs>
           <w:tab w:val="right" w:leader="dot" w:pos="8920"/>
         </w:tabs>
         <w:spacing w:line="360" w:lineRule="auto"/>
-        <w:ind w:left="0" w:firstLineChars="200" w:firstLine="560"/>
+        <w:ind w:left="0" w:firstLineChars="200" w:firstLine="400"/>
         <w:rPr>
           <w:rFonts w:ascii="Times New Roman" w:eastAsia="宋体" w:cstheme="minorBidi"/>
           <w:i w:val="0"/>
@@ -2063,12 +2017,12 @@
     </w:p>
     <w:p>
       <w:pPr>
-        <w:pStyle w:val="31"/>
+        <w:pStyle w:val="TOC3"/>
         <w:tabs>
           <w:tab w:val="right" w:leader="dot" w:pos="8920"/>
         </w:tabs>
         <w:spacing w:line="360" w:lineRule="auto"/>
-        <w:ind w:left="0" w:firstLineChars="200" w:firstLine="560"/>
+        <w:ind w:left="0" w:firstLineChars="200" w:firstLine="400"/>
         <w:rPr>
           <w:rFonts w:ascii="Times New Roman" w:eastAsia="宋体" w:cstheme="minorBidi"/>
           <w:i w:val="0"/>
@@ -2181,12 +2135,12 @@
     </w:p>
     <w:p>
       <w:pPr>
-        <w:pStyle w:val="21"/>
+        <w:pStyle w:val="TOC2"/>
         <w:tabs>
           <w:tab w:val="right" w:leader="dot" w:pos="8920"/>
         </w:tabs>
         <w:spacing w:line="360" w:lineRule="auto"/>
-        <w:ind w:left="0" w:firstLineChars="100" w:firstLine="280"/>
+        <w:ind w:left="0" w:firstLineChars="100" w:firstLine="200"/>
         <w:rPr>
           <w:rFonts w:ascii="Times New Roman" w:eastAsia="宋体" w:cstheme="minorBidi"/>
           <w:smallCaps w:val="0"/>
@@ -2289,7 +2243,7 @@
     </w:p>
     <w:p>
       <w:pPr>
-        <w:pStyle w:val="11"/>
+        <w:pStyle w:val="TOC1"/>
         <w:spacing w:before="0" w:after="0" w:line="360" w:lineRule="auto"/>
         <w:rPr>
           <w:rFonts w:ascii="Times New Roman" w:eastAsia="宋体" w:hAnsi="Times New Roman" w:cstheme="minorBidi"/>
@@ -2435,12 +2389,12 @@
     </w:p>
     <w:p>
       <w:pPr>
-        <w:pStyle w:val="21"/>
+        <w:pStyle w:val="TOC2"/>
         <w:tabs>
           <w:tab w:val="right" w:leader="dot" w:pos="8920"/>
         </w:tabs>
         <w:spacing w:line="360" w:lineRule="auto"/>
-        <w:ind w:left="0" w:firstLineChars="100" w:firstLine="280"/>
+        <w:ind w:left="0" w:firstLineChars="100" w:firstLine="200"/>
         <w:rPr>
           <w:rFonts w:ascii="Times New Roman" w:eastAsia="宋体" w:cstheme="minorBidi"/>
           <w:smallCaps w:val="0"/>
@@ -2543,12 +2497,12 @@
     </w:p>
     <w:p>
       <w:pPr>
-        <w:pStyle w:val="31"/>
+        <w:pStyle w:val="TOC3"/>
         <w:tabs>
           <w:tab w:val="right" w:leader="dot" w:pos="8920"/>
         </w:tabs>
         <w:spacing w:line="360" w:lineRule="auto"/>
-        <w:ind w:left="0" w:firstLineChars="200" w:firstLine="560"/>
+        <w:ind w:left="0" w:firstLineChars="200" w:firstLine="400"/>
         <w:rPr>
           <w:rFonts w:ascii="Times New Roman" w:eastAsia="宋体" w:cstheme="minorBidi"/>
           <w:i w:val="0"/>
@@ -2661,12 +2615,12 @@
     </w:p>
     <w:p>
       <w:pPr>
-        <w:pStyle w:val="31"/>
+        <w:pStyle w:val="TOC3"/>
         <w:tabs>
           <w:tab w:val="right" w:leader="dot" w:pos="8920"/>
         </w:tabs>
         <w:spacing w:line="360" w:lineRule="auto"/>
-        <w:ind w:left="0" w:firstLineChars="200" w:firstLine="560"/>
+        <w:ind w:left="0" w:firstLineChars="200" w:firstLine="400"/>
         <w:rPr>
           <w:rFonts w:ascii="Times New Roman" w:eastAsia="宋体" w:cstheme="minorBidi"/>
           <w:i w:val="0"/>
@@ -2801,12 +2755,12 @@
     </w:p>
     <w:p>
       <w:pPr>
-        <w:pStyle w:val="21"/>
+        <w:pStyle w:val="TOC2"/>
         <w:tabs>
           <w:tab w:val="right" w:leader="dot" w:pos="8920"/>
         </w:tabs>
         <w:spacing w:line="360" w:lineRule="auto"/>
-        <w:ind w:left="0" w:firstLineChars="100" w:firstLine="280"/>
+        <w:ind w:left="0" w:firstLineChars="100" w:firstLine="200"/>
         <w:rPr>
           <w:rFonts w:ascii="Times New Roman" w:eastAsia="宋体" w:cstheme="minorBidi"/>
           <w:smallCaps w:val="0"/>
@@ -2909,7 +2863,7 @@
     </w:p>
     <w:p>
       <w:pPr>
-        <w:pStyle w:val="11"/>
+        <w:pStyle w:val="TOC1"/>
         <w:spacing w:before="0" w:after="0" w:line="360" w:lineRule="auto"/>
         <w:rPr>
           <w:rFonts w:ascii="Times New Roman" w:eastAsia="宋体" w:hAnsi="Times New Roman" w:cstheme="minorBidi"/>
@@ -3055,12 +3009,12 @@
     </w:p>
     <w:p>
       <w:pPr>
-        <w:pStyle w:val="21"/>
+        <w:pStyle w:val="TOC2"/>
         <w:tabs>
           <w:tab w:val="right" w:leader="dot" w:pos="8920"/>
         </w:tabs>
         <w:spacing w:line="360" w:lineRule="auto"/>
-        <w:ind w:left="0" w:firstLineChars="100" w:firstLine="280"/>
+        <w:ind w:left="0" w:firstLineChars="100" w:firstLine="200"/>
         <w:rPr>
           <w:rFonts w:ascii="Times New Roman" w:eastAsia="宋体" w:cstheme="minorBidi"/>
           <w:smallCaps w:val="0"/>
@@ -3163,12 +3117,12 @@
     </w:p>
     <w:p>
       <w:pPr>
-        <w:pStyle w:val="31"/>
+        <w:pStyle w:val="TOC3"/>
         <w:tabs>
           <w:tab w:val="right" w:leader="dot" w:pos="8920"/>
         </w:tabs>
         <w:spacing w:line="360" w:lineRule="auto"/>
-        <w:ind w:left="0" w:firstLineChars="200" w:firstLine="560"/>
+        <w:ind w:left="0" w:firstLineChars="200" w:firstLine="400"/>
         <w:rPr>
           <w:rFonts w:ascii="Times New Roman" w:eastAsia="宋体" w:cstheme="minorBidi"/>
           <w:i w:val="0"/>
@@ -3281,12 +3235,12 @@
     </w:p>
     <w:p>
       <w:pPr>
-        <w:pStyle w:val="31"/>
+        <w:pStyle w:val="TOC3"/>
         <w:tabs>
           <w:tab w:val="right" w:leader="dot" w:pos="8920"/>
         </w:tabs>
         <w:spacing w:line="360" w:lineRule="auto"/>
-        <w:ind w:left="0" w:firstLineChars="200" w:firstLine="560"/>
+        <w:ind w:left="0" w:firstLineChars="200" w:firstLine="400"/>
         <w:rPr>
           <w:rFonts w:ascii="Times New Roman" w:eastAsia="宋体" w:cstheme="minorBidi"/>
           <w:i w:val="0"/>
@@ -3421,12 +3375,12 @@
     </w:p>
     <w:p>
       <w:pPr>
-        <w:pStyle w:val="21"/>
+        <w:pStyle w:val="TOC2"/>
         <w:tabs>
           <w:tab w:val="right" w:leader="dot" w:pos="8920"/>
         </w:tabs>
         <w:spacing w:line="360" w:lineRule="auto"/>
-        <w:ind w:left="0" w:firstLineChars="100" w:firstLine="280"/>
+        <w:ind w:left="0" w:firstLineChars="100" w:firstLine="200"/>
         <w:rPr>
           <w:rFonts w:ascii="Times New Roman" w:eastAsia="宋体" w:cstheme="minorBidi"/>
           <w:smallCaps w:val="0"/>
@@ -3529,7 +3483,7 @@
     </w:p>
     <w:p>
       <w:pPr>
-        <w:pStyle w:val="11"/>
+        <w:pStyle w:val="TOC1"/>
         <w:spacing w:before="0" w:after="0" w:line="360" w:lineRule="auto"/>
         <w:rPr>
           <w:rFonts w:ascii="Times New Roman" w:eastAsia="宋体" w:hAnsi="Times New Roman" w:cstheme="minorBidi"/>
@@ -3675,7 +3629,7 @@
     </w:p>
     <w:p>
       <w:pPr>
-        <w:pStyle w:val="11"/>
+        <w:pStyle w:val="TOC1"/>
         <w:spacing w:before="0" w:after="0" w:line="360" w:lineRule="auto"/>
         <w:rPr>
           <w:rFonts w:ascii="Times New Roman" w:eastAsia="宋体" w:hAnsi="Times New Roman" w:cstheme="minorBidi"/>
@@ -3777,7 +3731,7 @@
     </w:p>
     <w:p>
       <w:pPr>
-        <w:pStyle w:val="11"/>
+        <w:pStyle w:val="TOC1"/>
         <w:spacing w:before="0" w:after="0" w:line="360" w:lineRule="auto"/>
         <w:rPr>
           <w:rFonts w:ascii="Times New Roman" w:eastAsia="宋体" w:hAnsi="Times New Roman" w:cstheme="minorBidi"/>
@@ -4019,7 +3973,6 @@
         <w:spacing w:beforeLines="50" w:before="120" w:line="360" w:lineRule="auto"/>
         <w:ind w:firstLineChars="200" w:firstLine="480"/>
         <w:rPr>
-          <w:rFonts w:hint="eastAsia"/>
           <w:sz w:val="24"/>
         </w:rPr>
       </w:pPr>
@@ -4505,7 +4458,6 @@
         <w:spacing w:before="50" w:line="360" w:lineRule="auto"/>
         <w:ind w:firstLineChars="200" w:firstLine="480"/>
         <w:rPr>
-          <w:rFonts w:hint="eastAsia"/>
           <w:sz w:val="24"/>
         </w:rPr>
       </w:pPr>
@@ -4708,7 +4660,7 @@
           <w:sz w:val="24"/>
         </w:rPr>
         <w:drawing>
-          <wp:anchor distT="0" distB="0" distL="114300" distR="114300" simplePos="0" relativeHeight="251659264" behindDoc="0" locked="0" layoutInCell="1" allowOverlap="1" wp14:anchorId="6274FB95" wp14:editId="3CE4801C">
+          <wp:anchor distT="0" distB="0" distL="114300" distR="114300" simplePos="0" relativeHeight="251659264" behindDoc="0" locked="0" layoutInCell="1" allowOverlap="1" wp14:anchorId="6274FB95" wp14:editId="21E94904">
             <wp:simplePos x="0" y="0"/>
             <wp:positionH relativeFrom="page">
               <wp:posOffset>1287966</wp:posOffset>
@@ -5297,9 +5249,6 @@
         <w:snapToGrid w:val="0"/>
         <w:spacing w:beforeLines="50" w:before="120" w:line="360" w:lineRule="auto"/>
         <w:ind w:firstLineChars="200" w:firstLine="480"/>
-        <w:rPr>
-          <w:rFonts w:hint="eastAsia"/>
-        </w:rPr>
       </w:pPr>
       <w:r>
         <w:rPr>
@@ -5603,7 +5552,7 @@
           <w:sz w:val="24"/>
         </w:rPr>
         <w:drawing>
-          <wp:anchor distT="0" distB="0" distL="114300" distR="114300" simplePos="0" relativeHeight="251661312" behindDoc="0" locked="0" layoutInCell="1" allowOverlap="1" wp14:anchorId="25138B1D" wp14:editId="79CCA24F">
+          <wp:anchor distT="0" distB="0" distL="114300" distR="114300" simplePos="0" relativeHeight="251661312" behindDoc="0" locked="0" layoutInCell="1" allowOverlap="1" wp14:anchorId="25138B1D" wp14:editId="5FE9A845">
             <wp:simplePos x="0" y="0"/>
             <wp:positionH relativeFrom="page">
               <wp:posOffset>1262845</wp:posOffset>
@@ -5790,7 +5739,6 @@
         <w:spacing w:before="50" w:line="360" w:lineRule="auto"/>
         <w:ind w:firstLineChars="200" w:firstLine="480"/>
         <w:rPr>
-          <w:rFonts w:hint="eastAsia"/>
           <w:sz w:val="24"/>
         </w:rPr>
       </w:pPr>
@@ -7463,9 +7411,6 @@
         <w:snapToGrid w:val="0"/>
         <w:spacing w:beforeLines="50" w:before="120" w:line="360" w:lineRule="auto"/>
         <w:ind w:firstLineChars="200" w:firstLine="480"/>
-        <w:rPr>
-          <w:rFonts w:hint="eastAsia"/>
-        </w:rPr>
       </w:pPr>
       <w:r>
         <w:rPr>
@@ -7558,16 +7503,7 @@
           <w:rFonts w:hint="eastAsia"/>
           <w:sz w:val="24"/>
         </w:rPr>
-        <w:t>。（注意引</w:t>
-      </w:r>
-      <w:bookmarkStart w:id="11" w:name="_GoBack"/>
-      <w:bookmarkEnd w:id="11"/>
-      <w:r>
-        <w:rPr>
-          <w:rFonts w:hint="eastAsia"/>
-          <w:sz w:val="24"/>
-        </w:rPr>
-        <w:t>文一定要规范）</w:t>
+        <w:t>。（注意引文一定要规范）</w:t>
       </w:r>
     </w:p>
     <w:p>
@@ -7581,7 +7517,7 @@
           <w:szCs w:val="28"/>
         </w:rPr>
       </w:pPr>
-      <w:bookmarkStart w:id="12" w:name="_Toc101283360"/>
+      <w:bookmarkStart w:id="11" w:name="_Toc101283360"/>
       <w:r>
         <w:rPr>
           <w:rFonts w:ascii="Times New Roman" w:eastAsia="宋体" w:hAnsi="Times New Roman"/>
@@ -7598,7 +7534,7 @@
         </w:rPr>
         <w:t>氮化镓发光二极管的制备工艺</w:t>
       </w:r>
-      <w:bookmarkEnd w:id="12"/>
+      <w:bookmarkEnd w:id="11"/>
     </w:p>
     <w:p>
       <w:pPr>
@@ -7779,7 +7715,7 @@
           <w:szCs w:val="24"/>
         </w:rPr>
       </w:pPr>
-      <w:bookmarkStart w:id="13" w:name="_Toc101283361"/>
+      <w:bookmarkStart w:id="12" w:name="_Toc101283361"/>
       <w:r>
         <w:rPr>
           <w:sz w:val="24"/>
@@ -7802,7 +7738,7 @@
         </w:rPr>
         <w:t>工艺参数</w:t>
       </w:r>
-      <w:bookmarkEnd w:id="13"/>
+      <w:bookmarkEnd w:id="12"/>
     </w:p>
     <w:p>
       <w:pPr>
@@ -7810,7 +7746,6 @@
         <w:spacing w:before="50" w:line="360" w:lineRule="auto"/>
         <w:ind w:firstLineChars="200" w:firstLine="480"/>
         <w:rPr>
-          <w:rFonts w:hint="eastAsia"/>
           <w:sz w:val="24"/>
         </w:rPr>
       </w:pPr>
@@ -7954,7 +7889,7 @@
           <w:szCs w:val="24"/>
         </w:rPr>
       </w:pPr>
-      <w:bookmarkStart w:id="14" w:name="_Toc101283362"/>
+      <w:bookmarkStart w:id="13" w:name="_Toc101283362"/>
       <w:r>
         <w:rPr>
           <w:sz w:val="24"/>
@@ -8001,7 +7936,7 @@
         </w:rPr>
         <w:t>的发光光谱</w:t>
       </w:r>
-      <w:bookmarkEnd w:id="14"/>
+      <w:bookmarkEnd w:id="13"/>
     </w:p>
     <w:p>
       <w:pPr>
@@ -8155,7 +8090,6 @@
         <w:spacing w:before="50" w:line="360" w:lineRule="auto"/>
         <w:ind w:firstLineChars="200" w:firstLine="480"/>
         <w:rPr>
-          <w:rFonts w:hint="eastAsia"/>
           <w:sz w:val="24"/>
         </w:rPr>
       </w:pPr>
@@ -8184,7 +8118,7 @@
           <w:szCs w:val="28"/>
         </w:rPr>
       </w:pPr>
-      <w:bookmarkStart w:id="15" w:name="_Toc101283363"/>
+      <w:bookmarkStart w:id="14" w:name="_Toc101283363"/>
       <w:r>
         <w:rPr>
           <w:rFonts w:ascii="Times New Roman" w:eastAsia="宋体" w:hAnsi="Times New Roman"/>
@@ -8209,7 +8143,7 @@
         </w:rPr>
         <w:t>外量子效率</w:t>
       </w:r>
-      <w:bookmarkEnd w:id="15"/>
+      <w:bookmarkEnd w:id="14"/>
     </w:p>
     <w:p>
       <w:pPr>
@@ -8406,7 +8340,7 @@
           <w:szCs w:val="30"/>
         </w:rPr>
       </w:pPr>
-      <w:bookmarkStart w:id="16" w:name="_Toc101283364"/>
+      <w:bookmarkStart w:id="15" w:name="_Toc101283364"/>
       <w:r>
         <w:rPr>
           <w:rFonts w:hint="eastAsia"/>
@@ -8454,7 +8388,7 @@
         </w:rPr>
         <w:t>结论</w:t>
       </w:r>
-      <w:bookmarkEnd w:id="16"/>
+      <w:bookmarkEnd w:id="15"/>
     </w:p>
     <w:p>
       <w:pPr>
@@ -8604,13 +8538,13 @@
         <w:spacing w:before="0" w:after="0" w:line="360" w:lineRule="auto"/>
         <w:jc w:val="center"/>
         <w:rPr>
-          <w:rFonts w:ascii="宋体" w:hAnsi="宋体"/>
+          <w:rFonts w:ascii="宋体" w:hAnsi="宋体" w:hint="eastAsia"/>
           <w:color w:val="FF0000"/>
           <w:sz w:val="30"/>
           <w:szCs w:val="30"/>
         </w:rPr>
       </w:pPr>
-      <w:bookmarkStart w:id="17" w:name="_Toc101283365"/>
+      <w:bookmarkStart w:id="16" w:name="_Toc101283365"/>
       <w:r>
         <w:rPr>
           <w:rFonts w:ascii="宋体" w:hAnsi="宋体"/>
@@ -8620,7 +8554,7 @@
         <w:lastRenderedPageBreak/>
         <w:t>参考文献</w:t>
       </w:r>
-      <w:bookmarkEnd w:id="17"/>
+      <w:bookmarkEnd w:id="16"/>
     </w:p>
     <w:p>
       <w:pPr>
@@ -9186,7 +9120,6 @@
         <w:spacing w:line="360" w:lineRule="auto"/>
         <w:ind w:firstLineChars="0"/>
         <w:rPr>
-          <w:rFonts w:hint="eastAsia"/>
           <w:sz w:val="24"/>
         </w:rPr>
       </w:pPr>
@@ -9555,13 +9488,13 @@
         <w:spacing w:before="0" w:after="0" w:line="360" w:lineRule="auto"/>
         <w:jc w:val="center"/>
         <w:rPr>
-          <w:rFonts w:ascii="宋体" w:hAnsi="宋体"/>
+          <w:rFonts w:ascii="宋体" w:hAnsi="宋体" w:hint="eastAsia"/>
           <w:color w:val="FF0000"/>
           <w:sz w:val="30"/>
           <w:szCs w:val="30"/>
         </w:rPr>
       </w:pPr>
-      <w:bookmarkStart w:id="18" w:name="_Toc101283366"/>
+      <w:bookmarkStart w:id="17" w:name="_Toc101283366"/>
       <w:r>
         <w:rPr>
           <w:rFonts w:ascii="宋体" w:hAnsi="宋体" w:hint="eastAsia"/>
@@ -9587,7 +9520,7 @@
         </w:rPr>
         <w:t>谢</w:t>
       </w:r>
-      <w:bookmarkEnd w:id="18"/>
+      <w:bookmarkEnd w:id="17"/>
     </w:p>
     <w:p>
       <w:pPr>
@@ -9705,7 +9638,6 @@
         <w:spacing w:before="50" w:line="360" w:lineRule="auto"/>
         <w:ind w:firstLineChars="200" w:firstLine="480"/>
         <w:rPr>
-          <w:rFonts w:hint="eastAsia"/>
           <w:bCs/>
           <w:kern w:val="44"/>
           <w:sz w:val="24"/>
@@ -9722,20 +9654,8 @@
         </w:rPr>
       </w:pPr>
     </w:p>
-    <w:p>
-      <w:pPr>
-        <w:rPr>
-          <w:rFonts w:hint="eastAsia"/>
-        </w:rPr>
-      </w:pPr>
-    </w:p>
-    <w:p>
-      <w:pPr>
-        <w:rPr>
-          <w:rFonts w:hint="eastAsia"/>
-        </w:rPr>
-      </w:pPr>
-    </w:p>
+    <w:p/>
+    <w:p/>
     <w:p>
       <w:pPr>
         <w:snapToGrid w:val="0"/>
@@ -9752,24 +9672,16 @@
         <w:spacing w:before="50" w:line="360" w:lineRule="auto"/>
         <w:ind w:firstLineChars="200" w:firstLine="480"/>
         <w:rPr>
-          <w:rFonts w:hint="eastAsia"/>
-          <w:sz w:val="24"/>
-        </w:rPr>
-      </w:pPr>
-    </w:p>
-    <w:p>
-      <w:pPr>
-        <w:rPr>
-          <w:rFonts w:hint="eastAsia"/>
-        </w:rPr>
-      </w:pPr>
-    </w:p>
+          <w:sz w:val="24"/>
+        </w:rPr>
+      </w:pPr>
+    </w:p>
+    <w:p/>
     <w:p>
       <w:pPr>
         <w:spacing w:before="50" w:line="360" w:lineRule="auto"/>
         <w:ind w:firstLineChars="200" w:firstLine="480"/>
         <w:rPr>
-          <w:rFonts w:hint="eastAsia"/>
           <w:sz w:val="24"/>
         </w:rPr>
       </w:pPr>
@@ -9777,9 +9689,6 @@
     <w:p>
       <w:pPr>
         <w:spacing w:beforeLines="50" w:before="120" w:line="360" w:lineRule="auto"/>
-        <w:rPr>
-          <w:rFonts w:hint="eastAsia"/>
-        </w:rPr>
       </w:pPr>
     </w:p>
     <w:p>
@@ -9819,9 +9728,6 @@
       <w:pPr>
         <w:spacing w:beforeLines="50" w:before="120"/>
         <w:jc w:val="center"/>
-        <w:rPr>
-          <w:rFonts w:hint="eastAsia"/>
-        </w:rPr>
       </w:pPr>
     </w:p>
     <w:p/>
@@ -9839,7 +9745,7 @@
 </file>
 
 <file path=word/endnotes.xml><?xml version="1.0" encoding="utf-8"?>
-<w:endnotes xmlns:wpc="http://schemas.microsoft.com/office/word/2010/wordprocessingCanvas" xmlns:cx="http://schemas.microsoft.com/office/drawing/2014/chartex" xmlns:mc="http://schemas.openxmlformats.org/markup-compatibility/2006" xmlns:o="urn:schemas-microsoft-com:office:office" xmlns:r="http://schemas.openxmlformats.org/officeDocument/2006/relationships" xmlns:m="http://schemas.openxmlformats.org/officeDocument/2006/math" xmlns:v="urn:schemas-microsoft-com:vml" xmlns:wp14="http://schemas.microsoft.com/office/word/2010/wordprocessingDrawing" xmlns:wp="http://schemas.openxmlformats.org/drawingml/2006/wordprocessingDrawing" xmlns:w10="urn:schemas-microsoft-com:office:word" xmlns:w="http://schemas.openxmlformats.org/wordprocessingml/2006/main" xmlns:w14="http://schemas.microsoft.com/office/word/2010/wordml" xmlns:w15="http://schemas.microsoft.com/office/word/2012/wordml" xmlns:w16se="http://schemas.microsoft.com/office/word/2015/wordml/symex" xmlns:wpg="http://schemas.microsoft.com/office/word/2010/wordprocessingGroup" xmlns:wpi="http://schemas.microsoft.com/office/word/2010/wordprocessingInk" xmlns:wne="http://schemas.microsoft.com/office/word/2006/wordml" xmlns:wps="http://schemas.microsoft.com/office/word/2010/wordprocessingShape" mc:Ignorable="w14 w15 w16se wp14">
+<w:endnotes xmlns:wpc="http://schemas.microsoft.com/office/word/2010/wordprocessingCanvas" xmlns:cx="http://schemas.microsoft.com/office/drawing/2014/chartex" xmlns:cx1="http://schemas.microsoft.com/office/drawing/2015/9/8/chartex" xmlns:cx2="http://schemas.microsoft.com/office/drawing/2015/10/21/chartex" xmlns:cx3="http://schemas.microsoft.com/office/drawing/2016/5/9/chartex" xmlns:cx4="http://schemas.microsoft.com/office/drawing/2016/5/10/chartex" xmlns:cx5="http://schemas.microsoft.com/office/drawing/2016/5/11/chartex" xmlns:cx6="http://schemas.microsoft.com/office/drawing/2016/5/12/chartex" xmlns:cx7="http://schemas.microsoft.com/office/drawing/2016/5/13/chartex" xmlns:cx8="http://schemas.microsoft.com/office/drawing/2016/5/14/chartex" xmlns:mc="http://schemas.openxmlformats.org/markup-compatibility/2006" xmlns:aink="http://schemas.microsoft.com/office/drawing/2016/ink" xmlns:am3d="http://schemas.microsoft.com/office/drawing/2017/model3d" xmlns:o="urn:schemas-microsoft-com:office:office" xmlns:oel="http://schemas.microsoft.com/office/2019/extlst" xmlns:r="http://schemas.openxmlformats.org/officeDocument/2006/relationships" xmlns:m="http://schemas.openxmlformats.org/officeDocument/2006/math" xmlns:v="urn:schemas-microsoft-com:vml" xmlns:wp14="http://schemas.microsoft.com/office/word/2010/wordprocessingDrawing" xmlns:wp="http://schemas.openxmlformats.org/drawingml/2006/wordprocessingDrawing" xmlns:w10="urn:schemas-microsoft-com:office:word" xmlns:w="http://schemas.openxmlformats.org/wordprocessingml/2006/main" xmlns:w14="http://schemas.microsoft.com/office/word/2010/wordml" xmlns:w15="http://schemas.microsoft.com/office/word/2012/wordml" xmlns:w16cex="http://schemas.microsoft.com/office/word/2018/wordml/cex" xmlns:w16cid="http://schemas.microsoft.com/office/word/2016/wordml/cid" xmlns:w16="http://schemas.microsoft.com/office/word/2018/wordml" xmlns:w16du="http://schemas.microsoft.com/office/word/2023/wordml/word16du" xmlns:w16sdtdh="http://schemas.microsoft.com/office/word/2020/wordml/sdtdatahash" xmlns:w16sdtfl="http://schemas.microsoft.com/office/word/2024/wordml/sdtformatlock" xmlns:w16se="http://schemas.microsoft.com/office/word/2015/wordml/symex" xmlns:wpg="http://schemas.microsoft.com/office/word/2010/wordprocessingGroup" xmlns:wpi="http://schemas.microsoft.com/office/word/2010/wordprocessingInk" xmlns:wne="http://schemas.microsoft.com/office/word/2006/wordml" xmlns:wps="http://schemas.microsoft.com/office/word/2010/wordprocessingShape" mc:Ignorable="w14 w15 w16se w16cid w16 w16cex w16sdtdh w16sdtfl w16du wp14">
   <w:endnote w:type="separator" w:id="-1">
     <w:p>
       <w:r>
@@ -9858,7 +9764,7 @@
 </file>
 
 <file path=word/footer1.xml><?xml version="1.0" encoding="utf-8"?>
-<w:ftr xmlns:wpc="http://schemas.microsoft.com/office/word/2010/wordprocessingCanvas" xmlns:cx="http://schemas.microsoft.com/office/drawing/2014/chartex" xmlns:mc="http://schemas.openxmlformats.org/markup-compatibility/2006" xmlns:o="urn:schemas-microsoft-com:office:office" xmlns:r="http://schemas.openxmlformats.org/officeDocument/2006/relationships" xmlns:m="http://schemas.openxmlformats.org/officeDocument/2006/math" xmlns:v="urn:schemas-microsoft-com:vml" xmlns:wp14="http://schemas.microsoft.com/office/word/2010/wordprocessingDrawing" xmlns:wp="http://schemas.openxmlformats.org/drawingml/2006/wordprocessingDrawing" xmlns:w10="urn:schemas-microsoft-com:office:word" xmlns:w="http://schemas.openxmlformats.org/wordprocessingml/2006/main" xmlns:w14="http://schemas.microsoft.com/office/word/2010/wordml" xmlns:w15="http://schemas.microsoft.com/office/word/2012/wordml" xmlns:w16se="http://schemas.microsoft.com/office/word/2015/wordml/symex" xmlns:wpg="http://schemas.microsoft.com/office/word/2010/wordprocessingGroup" xmlns:wpi="http://schemas.microsoft.com/office/word/2010/wordprocessingInk" xmlns:wne="http://schemas.microsoft.com/office/word/2006/wordml" xmlns:wps="http://schemas.microsoft.com/office/word/2010/wordprocessingShape" mc:Ignorable="w14 w15 w16se wp14">
+<w:ftr xmlns:wpc="http://schemas.microsoft.com/office/word/2010/wordprocessingCanvas" xmlns:cx="http://schemas.microsoft.com/office/drawing/2014/chartex" xmlns:cx1="http://schemas.microsoft.com/office/drawing/2015/9/8/chartex" xmlns:cx2="http://schemas.microsoft.com/office/drawing/2015/10/21/chartex" xmlns:cx3="http://schemas.microsoft.com/office/drawing/2016/5/9/chartex" xmlns:cx4="http://schemas.microsoft.com/office/drawing/2016/5/10/chartex" xmlns:cx5="http://schemas.microsoft.com/office/drawing/2016/5/11/chartex" xmlns:cx6="http://schemas.microsoft.com/office/drawing/2016/5/12/chartex" xmlns:cx7="http://schemas.microsoft.com/office/drawing/2016/5/13/chartex" xmlns:cx8="http://schemas.microsoft.com/office/drawing/2016/5/14/chartex" xmlns:mc="http://schemas.openxmlformats.org/markup-compatibility/2006" xmlns:aink="http://schemas.microsoft.com/office/drawing/2016/ink" xmlns:am3d="http://schemas.microsoft.com/office/drawing/2017/model3d" xmlns:o="urn:schemas-microsoft-com:office:office" xmlns:oel="http://schemas.microsoft.com/office/2019/extlst" xmlns:r="http://schemas.openxmlformats.org/officeDocument/2006/relationships" xmlns:m="http://schemas.openxmlformats.org/officeDocument/2006/math" xmlns:v="urn:schemas-microsoft-com:vml" xmlns:wp14="http://schemas.microsoft.com/office/word/2010/wordprocessingDrawing" xmlns:wp="http://schemas.openxmlformats.org/drawingml/2006/wordprocessingDrawing" xmlns:w10="urn:schemas-microsoft-com:office:word" xmlns:w="http://schemas.openxmlformats.org/wordprocessingml/2006/main" xmlns:w14="http://schemas.microsoft.com/office/word/2010/wordml" xmlns:w15="http://schemas.microsoft.com/office/word/2012/wordml" xmlns:w16cex="http://schemas.microsoft.com/office/word/2018/wordml/cex" xmlns:w16cid="http://schemas.microsoft.com/office/word/2016/wordml/cid" xmlns:w16="http://schemas.microsoft.com/office/word/2018/wordml" xmlns:w16du="http://schemas.microsoft.com/office/word/2023/wordml/word16du" xmlns:w16sdtdh="http://schemas.microsoft.com/office/word/2020/wordml/sdtdatahash" xmlns:w16sdtfl="http://schemas.microsoft.com/office/word/2024/wordml/sdtformatlock" xmlns:w16se="http://schemas.microsoft.com/office/word/2015/wordml/symex" xmlns:wpg="http://schemas.microsoft.com/office/word/2010/wordprocessingGroup" xmlns:wpi="http://schemas.microsoft.com/office/word/2010/wordprocessingInk" xmlns:wne="http://schemas.microsoft.com/office/word/2006/wordml" xmlns:wps="http://schemas.microsoft.com/office/word/2010/wordprocessingShape" mc:Ignorable="w14 w15 w16se w16cid w16 w16cex w16sdtdh w16sdtfl w16du wp14">
   <w:sdt>
     <w:sdtPr>
       <w:id w:val="1337497452"/>
@@ -9904,7 +9810,7 @@
 </file>
 
 <file path=word/footer2.xml><?xml version="1.0" encoding="utf-8"?>
-<w:ftr xmlns:wpc="http://schemas.microsoft.com/office/word/2010/wordprocessingCanvas" xmlns:cx="http://schemas.microsoft.com/office/drawing/2014/chartex" xmlns:mc="http://schemas.openxmlformats.org/markup-compatibility/2006" xmlns:o="urn:schemas-microsoft-com:office:office" xmlns:r="http://schemas.openxmlformats.org/officeDocument/2006/relationships" xmlns:m="http://schemas.openxmlformats.org/officeDocument/2006/math" xmlns:v="urn:schemas-microsoft-com:vml" xmlns:wp14="http://schemas.microsoft.com/office/word/2010/wordprocessingDrawing" xmlns:wp="http://schemas.openxmlformats.org/drawingml/2006/wordprocessingDrawing" xmlns:w10="urn:schemas-microsoft-com:office:word" xmlns:w="http://schemas.openxmlformats.org/wordprocessingml/2006/main" xmlns:w14="http://schemas.microsoft.com/office/word/2010/wordml" xmlns:w15="http://schemas.microsoft.com/office/word/2012/wordml" xmlns:w16se="http://schemas.microsoft.com/office/word/2015/wordml/symex" xmlns:wpg="http://schemas.microsoft.com/office/word/2010/wordprocessingGroup" xmlns:wpi="http://schemas.microsoft.com/office/word/2010/wordprocessingInk" xmlns:wne="http://schemas.microsoft.com/office/word/2006/wordml" xmlns:wps="http://schemas.microsoft.com/office/word/2010/wordprocessingShape" mc:Ignorable="w14 w15 w16se wp14">
+<w:ftr xmlns:wpc="http://schemas.microsoft.com/office/word/2010/wordprocessingCanvas" xmlns:cx="http://schemas.microsoft.com/office/drawing/2014/chartex" xmlns:cx1="http://schemas.microsoft.com/office/drawing/2015/9/8/chartex" xmlns:cx2="http://schemas.microsoft.com/office/drawing/2015/10/21/chartex" xmlns:cx3="http://schemas.microsoft.com/office/drawing/2016/5/9/chartex" xmlns:cx4="http://schemas.microsoft.com/office/drawing/2016/5/10/chartex" xmlns:cx5="http://schemas.microsoft.com/office/drawing/2016/5/11/chartex" xmlns:cx6="http://schemas.microsoft.com/office/drawing/2016/5/12/chartex" xmlns:cx7="http://schemas.microsoft.com/office/drawing/2016/5/13/chartex" xmlns:cx8="http://schemas.microsoft.com/office/drawing/2016/5/14/chartex" xmlns:mc="http://schemas.openxmlformats.org/markup-compatibility/2006" xmlns:aink="http://schemas.microsoft.com/office/drawing/2016/ink" xmlns:am3d="http://schemas.microsoft.com/office/drawing/2017/model3d" xmlns:o="urn:schemas-microsoft-com:office:office" xmlns:oel="http://schemas.microsoft.com/office/2019/extlst" xmlns:r="http://schemas.openxmlformats.org/officeDocument/2006/relationships" xmlns:m="http://schemas.openxmlformats.org/officeDocument/2006/math" xmlns:v="urn:schemas-microsoft-com:vml" xmlns:wp14="http://schemas.microsoft.com/office/word/2010/wordprocessingDrawing" xmlns:wp="http://schemas.openxmlformats.org/drawingml/2006/wordprocessingDrawing" xmlns:w10="urn:schemas-microsoft-com:office:word" xmlns:w="http://schemas.openxmlformats.org/wordprocessingml/2006/main" xmlns:w14="http://schemas.microsoft.com/office/word/2010/wordml" xmlns:w15="http://schemas.microsoft.com/office/word/2012/wordml" xmlns:w16cex="http://schemas.microsoft.com/office/word/2018/wordml/cex" xmlns:w16cid="http://schemas.microsoft.com/office/word/2016/wordml/cid" xmlns:w16="http://schemas.microsoft.com/office/word/2018/wordml" xmlns:w16du="http://schemas.microsoft.com/office/word/2023/wordml/word16du" xmlns:w16sdtdh="http://schemas.microsoft.com/office/word/2020/wordml/sdtdatahash" xmlns:w16sdtfl="http://schemas.microsoft.com/office/word/2024/wordml/sdtformatlock" xmlns:w16se="http://schemas.microsoft.com/office/word/2015/wordml/symex" xmlns:wpg="http://schemas.microsoft.com/office/word/2010/wordprocessingGroup" xmlns:wpi="http://schemas.microsoft.com/office/word/2010/wordprocessingInk" xmlns:wne="http://schemas.microsoft.com/office/word/2006/wordml" xmlns:wps="http://schemas.microsoft.com/office/word/2010/wordprocessingShape" mc:Ignorable="w14 w15 w16se w16cid w16 w16cex w16sdtdh w16sdtfl w16du wp14">
   <w:sdt>
     <w:sdtPr>
       <w:id w:val="768355840"/>
@@ -9950,7 +9856,7 @@
 </file>
 
 <file path=word/footer3.xml><?xml version="1.0" encoding="utf-8"?>
-<w:ftr xmlns:wpc="http://schemas.microsoft.com/office/word/2010/wordprocessingCanvas" xmlns:cx="http://schemas.microsoft.com/office/drawing/2014/chartex" xmlns:mc="http://schemas.openxmlformats.org/markup-compatibility/2006" xmlns:o="urn:schemas-microsoft-com:office:office" xmlns:r="http://schemas.openxmlformats.org/officeDocument/2006/relationships" xmlns:m="http://schemas.openxmlformats.org/officeDocument/2006/math" xmlns:v="urn:schemas-microsoft-com:vml" xmlns:wp14="http://schemas.microsoft.com/office/word/2010/wordprocessingDrawing" xmlns:wp="http://schemas.openxmlformats.org/drawingml/2006/wordprocessingDrawing" xmlns:w10="urn:schemas-microsoft-com:office:word" xmlns:w="http://schemas.openxmlformats.org/wordprocessingml/2006/main" xmlns:w14="http://schemas.microsoft.com/office/word/2010/wordml" xmlns:w15="http://schemas.microsoft.com/office/word/2012/wordml" xmlns:w16se="http://schemas.microsoft.com/office/word/2015/wordml/symex" xmlns:wpg="http://schemas.microsoft.com/office/word/2010/wordprocessingGroup" xmlns:wpi="http://schemas.microsoft.com/office/word/2010/wordprocessingInk" xmlns:wne="http://schemas.microsoft.com/office/word/2006/wordml" xmlns:wps="http://schemas.microsoft.com/office/word/2010/wordprocessingShape" mc:Ignorable="w14 w15 w16se wp14">
+<w:ftr xmlns:wpc="http://schemas.microsoft.com/office/word/2010/wordprocessingCanvas" xmlns:cx="http://schemas.microsoft.com/office/drawing/2014/chartex" xmlns:cx1="http://schemas.microsoft.com/office/drawing/2015/9/8/chartex" xmlns:cx2="http://schemas.microsoft.com/office/drawing/2015/10/21/chartex" xmlns:cx3="http://schemas.microsoft.com/office/drawing/2016/5/9/chartex" xmlns:cx4="http://schemas.microsoft.com/office/drawing/2016/5/10/chartex" xmlns:cx5="http://schemas.microsoft.com/office/drawing/2016/5/11/chartex" xmlns:cx6="http://schemas.microsoft.com/office/drawing/2016/5/12/chartex" xmlns:cx7="http://schemas.microsoft.com/office/drawing/2016/5/13/chartex" xmlns:cx8="http://schemas.microsoft.com/office/drawing/2016/5/14/chartex" xmlns:mc="http://schemas.openxmlformats.org/markup-compatibility/2006" xmlns:aink="http://schemas.microsoft.com/office/drawing/2016/ink" xmlns:am3d="http://schemas.microsoft.com/office/drawing/2017/model3d" xmlns:o="urn:schemas-microsoft-com:office:office" xmlns:oel="http://schemas.microsoft.com/office/2019/extlst" xmlns:r="http://schemas.openxmlformats.org/officeDocument/2006/relationships" xmlns:m="http://schemas.openxmlformats.org/officeDocument/2006/math" xmlns:v="urn:schemas-microsoft-com:vml" xmlns:wp14="http://schemas.microsoft.com/office/word/2010/wordprocessingDrawing" xmlns:wp="http://schemas.openxmlformats.org/drawingml/2006/wordprocessingDrawing" xmlns:w10="urn:schemas-microsoft-com:office:word" xmlns:w="http://schemas.openxmlformats.org/wordprocessingml/2006/main" xmlns:w14="http://schemas.microsoft.com/office/word/2010/wordml" xmlns:w15="http://schemas.microsoft.com/office/word/2012/wordml" xmlns:w16cex="http://schemas.microsoft.com/office/word/2018/wordml/cex" xmlns:w16cid="http://schemas.microsoft.com/office/word/2016/wordml/cid" xmlns:w16="http://schemas.microsoft.com/office/word/2018/wordml" xmlns:w16du="http://schemas.microsoft.com/office/word/2023/wordml/word16du" xmlns:w16sdtdh="http://schemas.microsoft.com/office/word/2020/wordml/sdtdatahash" xmlns:w16sdtfl="http://schemas.microsoft.com/office/word/2024/wordml/sdtformatlock" xmlns:w16se="http://schemas.microsoft.com/office/word/2015/wordml/symex" xmlns:wpg="http://schemas.microsoft.com/office/word/2010/wordprocessingGroup" xmlns:wpi="http://schemas.microsoft.com/office/word/2010/wordprocessingInk" xmlns:wne="http://schemas.microsoft.com/office/word/2006/wordml" xmlns:wps="http://schemas.microsoft.com/office/word/2010/wordprocessingShape" mc:Ignorable="w14 w15 w16se w16cid w16 w16cex w16sdtdh w16sdtfl w16du wp14">
   <w:sdt>
     <w:sdtPr>
       <w:id w:val="1972629359"/>
@@ -9996,7 +9902,7 @@
 </file>
 
 <file path=word/footnotes.xml><?xml version="1.0" encoding="utf-8"?>
-<w:footnotes xmlns:wpc="http://schemas.microsoft.com/office/word/2010/wordprocessingCanvas" xmlns:cx="http://schemas.microsoft.com/office/drawing/2014/chartex" xmlns:mc="http://schemas.openxmlformats.org/markup-compatibility/2006" xmlns:o="urn:schemas-microsoft-com:office:office" xmlns:r="http://schemas.openxmlformats.org/officeDocument/2006/relationships" xmlns:m="http://schemas.openxmlformats.org/officeDocument/2006/math" xmlns:v="urn:schemas-microsoft-com:vml" xmlns:wp14="http://schemas.microsoft.com/office/word/2010/wordprocessingDrawing" xmlns:wp="http://schemas.openxmlformats.org/drawingml/2006/wordprocessingDrawing" xmlns:w10="urn:schemas-microsoft-com:office:word" xmlns:w="http://schemas.openxmlformats.org/wordprocessingml/2006/main" xmlns:w14="http://schemas.microsoft.com/office/word/2010/wordml" xmlns:w15="http://schemas.microsoft.com/office/word/2012/wordml" xmlns:w16se="http://schemas.microsoft.com/office/word/2015/wordml/symex" xmlns:wpg="http://schemas.microsoft.com/office/word/2010/wordprocessingGroup" xmlns:wpi="http://schemas.microsoft.com/office/word/2010/wordprocessingInk" xmlns:wne="http://schemas.microsoft.com/office/word/2006/wordml" xmlns:wps="http://schemas.microsoft.com/office/word/2010/wordprocessingShape" mc:Ignorable="w14 w15 w16se wp14">
+<w:footnotes xmlns:wpc="http://schemas.microsoft.com/office/word/2010/wordprocessingCanvas" xmlns:cx="http://schemas.microsoft.com/office/drawing/2014/chartex" xmlns:cx1="http://schemas.microsoft.com/office/drawing/2015/9/8/chartex" xmlns:cx2="http://schemas.microsoft.com/office/drawing/2015/10/21/chartex" xmlns:cx3="http://schemas.microsoft.com/office/drawing/2016/5/9/chartex" xmlns:cx4="http://schemas.microsoft.com/office/drawing/2016/5/10/chartex" xmlns:cx5="http://schemas.microsoft.com/office/drawing/2016/5/11/chartex" xmlns:cx6="http://schemas.microsoft.com/office/drawing/2016/5/12/chartex" xmlns:cx7="http://schemas.microsoft.com/office/drawing/2016/5/13/chartex" xmlns:cx8="http://schemas.microsoft.com/office/drawing/2016/5/14/chartex" xmlns:mc="http://schemas.openxmlformats.org/markup-compatibility/2006" xmlns:aink="http://schemas.microsoft.com/office/drawing/2016/ink" xmlns:am3d="http://schemas.microsoft.com/office/drawing/2017/model3d" xmlns:o="urn:schemas-microsoft-com:office:office" xmlns:oel="http://schemas.microsoft.com/office/2019/extlst" xmlns:r="http://schemas.openxmlformats.org/officeDocument/2006/relationships" xmlns:m="http://schemas.openxmlformats.org/officeDocument/2006/math" xmlns:v="urn:schemas-microsoft-com:vml" xmlns:wp14="http://schemas.microsoft.com/office/word/2010/wordprocessingDrawing" xmlns:wp="http://schemas.openxmlformats.org/drawingml/2006/wordprocessingDrawing" xmlns:w10="urn:schemas-microsoft-com:office:word" xmlns:w="http://schemas.openxmlformats.org/wordprocessingml/2006/main" xmlns:w14="http://schemas.microsoft.com/office/word/2010/wordml" xmlns:w15="http://schemas.microsoft.com/office/word/2012/wordml" xmlns:w16cex="http://schemas.microsoft.com/office/word/2018/wordml/cex" xmlns:w16cid="http://schemas.microsoft.com/office/word/2016/wordml/cid" xmlns:w16="http://schemas.microsoft.com/office/word/2018/wordml" xmlns:w16du="http://schemas.microsoft.com/office/word/2023/wordml/word16du" xmlns:w16sdtdh="http://schemas.microsoft.com/office/word/2020/wordml/sdtdatahash" xmlns:w16sdtfl="http://schemas.microsoft.com/office/word/2024/wordml/sdtformatlock" xmlns:w16se="http://schemas.microsoft.com/office/word/2015/wordml/symex" xmlns:wpg="http://schemas.microsoft.com/office/word/2010/wordprocessingGroup" xmlns:wpi="http://schemas.microsoft.com/office/word/2010/wordprocessingInk" xmlns:wne="http://schemas.microsoft.com/office/word/2006/wordml" xmlns:wps="http://schemas.microsoft.com/office/word/2010/wordprocessingShape" mc:Ignorable="w14 w15 w16se w16cid w16 w16cex w16sdtdh w16sdtfl w16du wp14">
   <w:footnote w:type="separator" w:id="-1">
     <w:p>
       <w:r>
@@ -10015,7 +9921,7 @@
 </file>
 
 <file path=word/header1.xml><?xml version="1.0" encoding="utf-8"?>
-<w:hdr xmlns:wpc="http://schemas.microsoft.com/office/word/2010/wordprocessingCanvas" xmlns:cx="http://schemas.microsoft.com/office/drawing/2014/chartex" xmlns:mc="http://schemas.openxmlformats.org/markup-compatibility/2006" xmlns:o="urn:schemas-microsoft-com:office:office" xmlns:r="http://schemas.openxmlformats.org/officeDocument/2006/relationships" xmlns:m="http://schemas.openxmlformats.org/officeDocument/2006/math" xmlns:v="urn:schemas-microsoft-com:vml" xmlns:wp14="http://schemas.microsoft.com/office/word/2010/wordprocessingDrawing" xmlns:wp="http://schemas.openxmlformats.org/drawingml/2006/wordprocessingDrawing" xmlns:w10="urn:schemas-microsoft-com:office:word" xmlns:w="http://schemas.openxmlformats.org/wordprocessingml/2006/main" xmlns:w14="http://schemas.microsoft.com/office/word/2010/wordml" xmlns:w15="http://schemas.microsoft.com/office/word/2012/wordml" xmlns:w16se="http://schemas.microsoft.com/office/word/2015/wordml/symex" xmlns:wpg="http://schemas.microsoft.com/office/word/2010/wordprocessingGroup" xmlns:wpi="http://schemas.microsoft.com/office/word/2010/wordprocessingInk" xmlns:wne="http://schemas.microsoft.com/office/word/2006/wordml" xmlns:wps="http://schemas.microsoft.com/office/word/2010/wordprocessingShape" mc:Ignorable="w14 w15 w16se wp14">
+<w:hdr xmlns:wpc="http://schemas.microsoft.com/office/word/2010/wordprocessingCanvas" xmlns:cx="http://schemas.microsoft.com/office/drawing/2014/chartex" xmlns:cx1="http://schemas.microsoft.com/office/drawing/2015/9/8/chartex" xmlns:cx2="http://schemas.microsoft.com/office/drawing/2015/10/21/chartex" xmlns:cx3="http://schemas.microsoft.com/office/drawing/2016/5/9/chartex" xmlns:cx4="http://schemas.microsoft.com/office/drawing/2016/5/10/chartex" xmlns:cx5="http://schemas.microsoft.com/office/drawing/2016/5/11/chartex" xmlns:cx6="http://schemas.microsoft.com/office/drawing/2016/5/12/chartex" xmlns:cx7="http://schemas.microsoft.com/office/drawing/2016/5/13/chartex" xmlns:cx8="http://schemas.microsoft.com/office/drawing/2016/5/14/chartex" xmlns:mc="http://schemas.openxmlformats.org/markup-compatibility/2006" xmlns:aink="http://schemas.microsoft.com/office/drawing/2016/ink" xmlns:am3d="http://schemas.microsoft.com/office/drawing/2017/model3d" xmlns:o="urn:schemas-microsoft-com:office:office" xmlns:oel="http://schemas.microsoft.com/office/2019/extlst" xmlns:r="http://schemas.openxmlformats.org/officeDocument/2006/relationships" xmlns:m="http://schemas.openxmlformats.org/officeDocument/2006/math" xmlns:v="urn:schemas-microsoft-com:vml" xmlns:wp14="http://schemas.microsoft.com/office/word/2010/wordprocessingDrawing" xmlns:wp="http://schemas.openxmlformats.org/drawingml/2006/wordprocessingDrawing" xmlns:w10="urn:schemas-microsoft-com:office:word" xmlns:w="http://schemas.openxmlformats.org/wordprocessingml/2006/main" xmlns:w14="http://schemas.microsoft.com/office/word/2010/wordml" xmlns:w15="http://schemas.microsoft.com/office/word/2012/wordml" xmlns:w16cex="http://schemas.microsoft.com/office/word/2018/wordml/cex" xmlns:w16cid="http://schemas.microsoft.com/office/word/2016/wordml/cid" xmlns:w16="http://schemas.microsoft.com/office/word/2018/wordml" xmlns:w16du="http://schemas.microsoft.com/office/word/2023/wordml/word16du" xmlns:w16sdtdh="http://schemas.microsoft.com/office/word/2020/wordml/sdtdatahash" xmlns:w16sdtfl="http://schemas.microsoft.com/office/word/2024/wordml/sdtformatlock" xmlns:w16se="http://schemas.microsoft.com/office/word/2015/wordml/symex" xmlns:wpg="http://schemas.microsoft.com/office/word/2010/wordprocessingGroup" xmlns:wpi="http://schemas.microsoft.com/office/word/2010/wordprocessingInk" xmlns:wne="http://schemas.microsoft.com/office/word/2006/wordml" xmlns:wps="http://schemas.microsoft.com/office/word/2010/wordprocessingShape" mc:Ignorable="w14 w15 w16se w16cid w16 w16cex w16sdtdh w16sdtfl w16du wp14">
   <w:p>
     <w:pPr>
       <w:pStyle w:val="a3"/>
@@ -10028,7 +9934,7 @@
 </file>
 
 <file path=word/numbering.xml><?xml version="1.0" encoding="utf-8"?>
-<w:numbering xmlns:wpc="http://schemas.microsoft.com/office/word/2010/wordprocessingCanvas" xmlns:cx="http://schemas.microsoft.com/office/drawing/2014/chartex" xmlns:mc="http://schemas.openxmlformats.org/markup-compatibility/2006" xmlns:o="urn:schemas-microsoft-com:office:office" xmlns:r="http://schemas.openxmlformats.org/officeDocument/2006/relationships" xmlns:m="http://schemas.openxmlformats.org/officeDocument/2006/math" xmlns:v="urn:schemas-microsoft-com:vml" xmlns:wp14="http://schemas.microsoft.com/office/word/2010/wordprocessingDrawing" xmlns:wp="http://schemas.openxmlformats.org/drawingml/2006/wordprocessingDrawing" xmlns:w10="urn:schemas-microsoft-com:office:word" xmlns:w="http://schemas.openxmlformats.org/wordprocessingml/2006/main" xmlns:w14="http://schemas.microsoft.com/office/word/2010/wordml" xmlns:w15="http://schemas.microsoft.com/office/word/2012/wordml" xmlns:w16se="http://schemas.microsoft.com/office/word/2015/wordml/symex" xmlns:wpg="http://schemas.microsoft.com/office/word/2010/wordprocessingGroup" xmlns:wpi="http://schemas.microsoft.com/office/word/2010/wordprocessingInk" xmlns:wne="http://schemas.microsoft.com/office/word/2006/wordml" xmlns:wps="http://schemas.microsoft.com/office/word/2010/wordprocessingShape" mc:Ignorable="w14 w15 w16se wp14">
+<w:numbering xmlns:wpc="http://schemas.microsoft.com/office/word/2010/wordprocessingCanvas" xmlns:cx="http://schemas.microsoft.com/office/drawing/2014/chartex" xmlns:cx1="http://schemas.microsoft.com/office/drawing/2015/9/8/chartex" xmlns:cx2="http://schemas.microsoft.com/office/drawing/2015/10/21/chartex" xmlns:cx3="http://schemas.microsoft.com/office/drawing/2016/5/9/chartex" xmlns:cx4="http://schemas.microsoft.com/office/drawing/2016/5/10/chartex" xmlns:cx5="http://schemas.microsoft.com/office/drawing/2016/5/11/chartex" xmlns:cx6="http://schemas.microsoft.com/office/drawing/2016/5/12/chartex" xmlns:cx7="http://schemas.microsoft.com/office/drawing/2016/5/13/chartex" xmlns:cx8="http://schemas.microsoft.com/office/drawing/2016/5/14/chartex" xmlns:mc="http://schemas.openxmlformats.org/markup-compatibility/2006" xmlns:aink="http://schemas.microsoft.com/office/drawing/2016/ink" xmlns:am3d="http://schemas.microsoft.com/office/drawing/2017/model3d" xmlns:o="urn:schemas-microsoft-com:office:office" xmlns:oel="http://schemas.microsoft.com/office/2019/extlst" xmlns:r="http://schemas.openxmlformats.org/officeDocument/2006/relationships" xmlns:m="http://schemas.openxmlformats.org/officeDocument/2006/math" xmlns:v="urn:schemas-microsoft-com:vml" xmlns:wp14="http://schemas.microsoft.com/office/word/2010/wordprocessingDrawing" xmlns:wp="http://schemas.openxmlformats.org/drawingml/2006/wordprocessingDrawing" xmlns:w10="urn:schemas-microsoft-com:office:word" xmlns:w="http://schemas.openxmlformats.org/wordprocessingml/2006/main" xmlns:w14="http://schemas.microsoft.com/office/word/2010/wordml" xmlns:w15="http://schemas.microsoft.com/office/word/2012/wordml" xmlns:w16cex="http://schemas.microsoft.com/office/word/2018/wordml/cex" xmlns:w16cid="http://schemas.microsoft.com/office/word/2016/wordml/cid" xmlns:w16="http://schemas.microsoft.com/office/word/2018/wordml" xmlns:w16du="http://schemas.microsoft.com/office/word/2023/wordml/word16du" xmlns:w16sdtdh="http://schemas.microsoft.com/office/word/2020/wordml/sdtdatahash" xmlns:w16sdtfl="http://schemas.microsoft.com/office/word/2024/wordml/sdtformatlock" xmlns:w16se="http://schemas.microsoft.com/office/word/2015/wordml/symex" xmlns:wpg="http://schemas.microsoft.com/office/word/2010/wordprocessingGroup" xmlns:wpi="http://schemas.microsoft.com/office/word/2010/wordprocessingInk" xmlns:wne="http://schemas.microsoft.com/office/word/2006/wordml" xmlns:wps="http://schemas.microsoft.com/office/word/2010/wordprocessingShape" mc:Ignorable="w14 w15 w16se w16cid w16 w16cex w16sdtdh w16sdtfl w16du wp14">
   <w:abstractNum w:abstractNumId="0" w15:restartNumberingAfterBreak="0">
     <w:nsid w:val="FFFFFF7D"/>
     <w:multiLevelType w:val="singleLevel"/>
@@ -10426,26 +10332,26 @@
       </w:pPr>
     </w:lvl>
   </w:abstractNum>
-  <w:num w:numId="1">
+  <w:num w:numId="1" w16cid:durableId="1914125346">
     <w:abstractNumId w:val="3"/>
   </w:num>
-  <w:num w:numId="2">
+  <w:num w:numId="2" w16cid:durableId="1717240546">
     <w:abstractNumId w:val="1"/>
   </w:num>
-  <w:num w:numId="3">
+  <w:num w:numId="3" w16cid:durableId="2114863987">
     <w:abstractNumId w:val="4"/>
   </w:num>
-  <w:num w:numId="4">
+  <w:num w:numId="4" w16cid:durableId="2056077225">
     <w:abstractNumId w:val="2"/>
   </w:num>
-  <w:num w:numId="5">
+  <w:num w:numId="5" w16cid:durableId="226065678">
     <w:abstractNumId w:val="0"/>
   </w:num>
 </w:numbering>
 </file>
 
 <file path=word/styles.xml><?xml version="1.0" encoding="utf-8"?>
-<w:styles xmlns:mc="http://schemas.openxmlformats.org/markup-compatibility/2006" xmlns:r="http://schemas.openxmlformats.org/officeDocument/2006/relationships" xmlns:w="http://schemas.openxmlformats.org/wordprocessingml/2006/main" xmlns:w14="http://schemas.microsoft.com/office/word/2010/wordml" xmlns:w15="http://schemas.microsoft.com/office/word/2012/wordml" xmlns:w16se="http://schemas.microsoft.com/office/word/2015/wordml/symex" mc:Ignorable="w14 w15 w16se">
+<w:styles xmlns:mc="http://schemas.openxmlformats.org/markup-compatibility/2006" xmlns:r="http://schemas.openxmlformats.org/officeDocument/2006/relationships" xmlns:w="http://schemas.openxmlformats.org/wordprocessingml/2006/main" xmlns:w14="http://schemas.microsoft.com/office/word/2010/wordml" xmlns:w15="http://schemas.microsoft.com/office/word/2012/wordml" xmlns:w16cex="http://schemas.microsoft.com/office/word/2018/wordml/cex" xmlns:w16cid="http://schemas.microsoft.com/office/word/2016/wordml/cid" xmlns:w16="http://schemas.microsoft.com/office/word/2018/wordml" xmlns:w16du="http://schemas.microsoft.com/office/word/2023/wordml/word16du" xmlns:w16sdtdh="http://schemas.microsoft.com/office/word/2020/wordml/sdtdatahash" xmlns:w16sdtfl="http://schemas.microsoft.com/office/word/2024/wordml/sdtformatlock" xmlns:w16se="http://schemas.microsoft.com/office/word/2015/wordml/symex" mc:Ignorable="w14 w15 w16se w16cid w16 w16cex w16sdtdh w16sdtfl w16du">
   <w:docDefaults>
     <w:rPrDefault>
       <w:rPr>
@@ -10458,7 +10364,7 @@
     </w:rPrDefault>
     <w:pPrDefault/>
   </w:docDefaults>
-  <w:latentStyles w:defLockedState="0" w:defUIPriority="99" w:defSemiHidden="0" w:defUnhideWhenUsed="0" w:defQFormat="0" w:count="371">
+  <w:latentStyles w:defLockedState="0" w:defUIPriority="99" w:defSemiHidden="0" w:defUnhideWhenUsed="0" w:defQFormat="0" w:count="376">
     <w:lsdException w:name="Normal" w:uiPriority="0" w:qFormat="1"/>
     <w:lsdException w:name="heading 1" w:uiPriority="9" w:qFormat="1"/>
     <w:lsdException w:name="heading 2" w:semiHidden="1" w:uiPriority="9" w:unhideWhenUsed="1" w:qFormat="1"/>
@@ -10830,6 +10736,11 @@
     <w:lsdException w:name="List Table 5 Dark Accent 6" w:uiPriority="50"/>
     <w:lsdException w:name="List Table 6 Colorful Accent 6" w:uiPriority="51"/>
     <w:lsdException w:name="List Table 7 Colorful Accent 6" w:uiPriority="52"/>
+    <w:lsdException w:name="Mention" w:semiHidden="1" w:unhideWhenUsed="1"/>
+    <w:lsdException w:name="Smart Hyperlink" w:semiHidden="1" w:unhideWhenUsed="1"/>
+    <w:lsdException w:name="Hashtag" w:semiHidden="1" w:unhideWhenUsed="1"/>
+    <w:lsdException w:name="Unresolved Mention" w:semiHidden="1" w:unhideWhenUsed="1"/>
+    <w:lsdException w:name="Smart Link" w:semiHidden="1" w:unhideWhenUsed="1"/>
   </w:latentStyles>
   <w:style w:type="paragraph" w:default="1" w:styleId="a">
     <w:name w:val="Normal"/>
@@ -10914,7 +10825,6 @@
   <w:style w:type="character" w:default="1" w:styleId="a0">
     <w:name w:val="Default Paragraph Font"/>
     <w:uiPriority w:val="1"/>
-    <w:semiHidden/>
     <w:unhideWhenUsed/>
   </w:style>
   <w:style w:type="table" w:default="1" w:styleId="a1">
@@ -10942,7 +10852,7 @@
     <w:name w:val="header"/>
     <w:aliases w:val="学位论文页眉"/>
     <w:basedOn w:val="a"/>
-    <w:link w:val="Char"/>
+    <w:link w:val="11"/>
     <w:rsid w:val="00814D99"/>
     <w:pPr>
       <w:pBdr>
@@ -10972,9 +10882,9 @@
       <w:szCs w:val="18"/>
     </w:rPr>
   </w:style>
-  <w:style w:type="character" w:customStyle="1" w:styleId="Char">
-    <w:name w:val="页眉 Char"/>
-    <w:aliases w:val="学位论文页眉 Char"/>
+  <w:style w:type="character" w:customStyle="1" w:styleId="11">
+    <w:name w:val="页眉 字符1"/>
+    <w:aliases w:val="学位论文页眉 字符"/>
     <w:link w:val="a3"/>
     <w:locked/>
     <w:rsid w:val="00814D99"/>
@@ -11062,7 +10972,7 @@
       <w:ind w:firstLineChars="200" w:firstLine="420"/>
     </w:pPr>
   </w:style>
-  <w:style w:type="paragraph" w:styleId="21">
+  <w:style w:type="paragraph" w:styleId="TOC2">
     <w:name w:val="toc 2"/>
     <w:basedOn w:val="a"/>
     <w:next w:val="a"/>
@@ -11152,7 +11062,7 @@
       <w:szCs w:val="32"/>
     </w:rPr>
   </w:style>
-  <w:style w:type="paragraph" w:styleId="11">
+  <w:style w:type="paragraph" w:styleId="TOC1">
     <w:name w:val="toc 1"/>
     <w:basedOn w:val="a"/>
     <w:next w:val="a"/>
@@ -11177,7 +11087,7 @@
       <w:szCs w:val="32"/>
     </w:rPr>
   </w:style>
-  <w:style w:type="paragraph" w:styleId="31">
+  <w:style w:type="paragraph" w:styleId="TOC3">
     <w:name w:val="toc 3"/>
     <w:basedOn w:val="a"/>
     <w:next w:val="a"/>
@@ -11208,7 +11118,7 @@
       <w:u w:val="single"/>
     </w:rPr>
   </w:style>
-  <w:style w:type="paragraph" w:styleId="4">
+  <w:style w:type="paragraph" w:styleId="TOC4">
     <w:name w:val="toc 4"/>
     <w:basedOn w:val="a"/>
     <w:next w:val="a"/>
@@ -11226,7 +11136,7 @@
       <w:szCs w:val="18"/>
     </w:rPr>
   </w:style>
-  <w:style w:type="paragraph" w:styleId="5">
+  <w:style w:type="paragraph" w:styleId="TOC5">
     <w:name w:val="toc 5"/>
     <w:basedOn w:val="a"/>
     <w:next w:val="a"/>
@@ -11244,7 +11154,7 @@
       <w:szCs w:val="18"/>
     </w:rPr>
   </w:style>
-  <w:style w:type="paragraph" w:styleId="6">
+  <w:style w:type="paragraph" w:styleId="TOC6">
     <w:name w:val="toc 6"/>
     <w:basedOn w:val="a"/>
     <w:next w:val="a"/>
@@ -11262,7 +11172,7 @@
       <w:szCs w:val="18"/>
     </w:rPr>
   </w:style>
-  <w:style w:type="paragraph" w:styleId="7">
+  <w:style w:type="paragraph" w:styleId="TOC7">
     <w:name w:val="toc 7"/>
     <w:basedOn w:val="a"/>
     <w:next w:val="a"/>
@@ -11280,7 +11190,7 @@
       <w:szCs w:val="18"/>
     </w:rPr>
   </w:style>
-  <w:style w:type="paragraph" w:styleId="8">
+  <w:style w:type="paragraph" w:styleId="TOC8">
     <w:name w:val="toc 8"/>
     <w:basedOn w:val="a"/>
     <w:next w:val="a"/>
@@ -11298,7 +11208,7 @@
       <w:szCs w:val="18"/>
     </w:rPr>
   </w:style>
-  <w:style w:type="paragraph" w:styleId="9">
+  <w:style w:type="paragraph" w:styleId="TOC9">
     <w:name w:val="toc 9"/>
     <w:basedOn w:val="a"/>
     <w:next w:val="a"/>
@@ -11317,565 +11227,6 @@
     </w:rPr>
   </w:style>
 </w:styles>
-</file>
-
-<file path=word/glossary/document.xml><?xml version="1.0" encoding="utf-8"?>
-<w:glossaryDocument xmlns:wpc="http://schemas.microsoft.com/office/word/2010/wordprocessingCanvas" xmlns:cx="http://schemas.microsoft.com/office/drawing/2014/chartex" xmlns:mc="http://schemas.openxmlformats.org/markup-compatibility/2006" xmlns:o="urn:schemas-microsoft-com:office:office" xmlns:r="http://schemas.openxmlformats.org/officeDocument/2006/relationships" xmlns:m="http://schemas.openxmlformats.org/officeDocument/2006/math" xmlns:v="urn:schemas-microsoft-com:vml" xmlns:wp14="http://schemas.microsoft.com/office/word/2010/wordprocessingDrawing" xmlns:wp="http://schemas.openxmlformats.org/drawingml/2006/wordprocessingDrawing" xmlns:w10="urn:schemas-microsoft-com:office:word" xmlns:w="http://schemas.openxmlformats.org/wordprocessingml/2006/main" xmlns:w14="http://schemas.microsoft.com/office/word/2010/wordml" xmlns:w15="http://schemas.microsoft.com/office/word/2012/wordml" xmlns:w16se="http://schemas.microsoft.com/office/word/2015/wordml/symex" xmlns:wpg="http://schemas.microsoft.com/office/word/2010/wordprocessingGroup" xmlns:wpi="http://schemas.microsoft.com/office/word/2010/wordprocessingInk" xmlns:wne="http://schemas.microsoft.com/office/word/2006/wordml" xmlns:wps="http://schemas.microsoft.com/office/word/2010/wordprocessingShape" mc:Ignorable="w14 w15 w16se wp14"/>
-</file>
-
-<file path=word/glossary/fontTable.xml><?xml version="1.0" encoding="utf-8"?>
-<w:fonts xmlns:mc="http://schemas.openxmlformats.org/markup-compatibility/2006" xmlns:r="http://schemas.openxmlformats.org/officeDocument/2006/relationships" xmlns:w="http://schemas.openxmlformats.org/wordprocessingml/2006/main" xmlns:w14="http://schemas.microsoft.com/office/word/2010/wordml" xmlns:w15="http://schemas.microsoft.com/office/word/2012/wordml" xmlns:w16se="http://schemas.microsoft.com/office/word/2015/wordml/symex" mc:Ignorable="w14 w15 w16se">
-  <w:font w:name="Times New Roman">
-    <w:panose1 w:val="02020603050405020304"/>
-    <w:charset w:val="00"/>
-    <w:family w:val="roman"/>
-    <w:pitch w:val="variable"/>
-    <w:sig w:usb0="E0002EFF" w:usb1="C000785B" w:usb2="00000009" w:usb3="00000000" w:csb0="000001FF" w:csb1="00000000"/>
-  </w:font>
-  <w:font w:name="等线">
-    <w:altName w:val="DengXian"/>
-    <w:panose1 w:val="02010600030101010101"/>
-    <w:charset w:val="86"/>
-    <w:family w:val="auto"/>
-    <w:pitch w:val="variable"/>
-    <w:sig w:usb0="A00002BF" w:usb1="38CF7CFA" w:usb2="00000016" w:usb3="00000000" w:csb0="0004000F" w:csb1="00000000"/>
-  </w:font>
-  <w:font w:name="宋体">
-    <w:altName w:val="SimSun"/>
-    <w:panose1 w:val="02010600030101010101"/>
-    <w:charset w:val="86"/>
-    <w:family w:val="auto"/>
-    <w:pitch w:val="variable"/>
-    <w:sig w:usb0="00000003" w:usb1="288F0000" w:usb2="00000016" w:usb3="00000000" w:csb0="00040001" w:csb1="00000000"/>
-  </w:font>
-  <w:font w:name="等线 Light">
-    <w:panose1 w:val="02010600030101010101"/>
-    <w:charset w:val="86"/>
-    <w:family w:val="auto"/>
-    <w:pitch w:val="variable"/>
-    <w:sig w:usb0="A00002BF" w:usb1="38CF7CFA" w:usb2="00000016" w:usb3="00000000" w:csb0="0004000F" w:csb1="00000000"/>
-  </w:font>
-  <w:font w:name="黑体">
-    <w:altName w:val="SimHei"/>
-    <w:panose1 w:val="02010609060101010101"/>
-    <w:charset w:val="86"/>
-    <w:family w:val="modern"/>
-    <w:pitch w:val="fixed"/>
-    <w:sig w:usb0="800002BF" w:usb1="38CF7CFA" w:usb2="00000016" w:usb3="00000000" w:csb0="00040001" w:csb1="00000000"/>
-  </w:font>
-  <w:font w:name="仿宋_GB2312">
-    <w:panose1 w:val="02010609030101010101"/>
-    <w:charset w:val="86"/>
-    <w:family w:val="modern"/>
-    <w:pitch w:val="fixed"/>
-    <w:sig w:usb0="00000001" w:usb1="080E0000" w:usb2="00000010" w:usb3="00000000" w:csb0="00040000" w:csb1="00000000"/>
-  </w:font>
-</w:fonts>
-</file>
-
-<file path=word/glossary/settings.xml><?xml version="1.0" encoding="utf-8"?>
-<w:settings xmlns:mc="http://schemas.openxmlformats.org/markup-compatibility/2006" xmlns:o="urn:schemas-microsoft-com:office:office" xmlns:r="http://schemas.openxmlformats.org/officeDocument/2006/relationships" xmlns:m="http://schemas.openxmlformats.org/officeDocument/2006/math" xmlns:v="urn:schemas-microsoft-com:vml" xmlns:w10="urn:schemas-microsoft-com:office:word" xmlns:w="http://schemas.openxmlformats.org/wordprocessingml/2006/main" xmlns:w14="http://schemas.microsoft.com/office/word/2010/wordml" xmlns:w15="http://schemas.microsoft.com/office/word/2012/wordml" xmlns:w16se="http://schemas.microsoft.com/office/word/2015/wordml/symex" xmlns:sl="http://schemas.openxmlformats.org/schemaLibrary/2006/main" mc:Ignorable="w14 w15 w16se">
-  <w:view w:val="normal"/>
-  <w:bordersDoNotSurroundHeader/>
-  <w:bordersDoNotSurroundFooter/>
-  <w:defaultTabStop w:val="420"/>
-  <w:drawingGridVerticalSpacing w:val="156"/>
-  <w:displayHorizontalDrawingGridEvery w:val="0"/>
-  <w:displayVerticalDrawingGridEvery w:val="2"/>
-  <w:characterSpacingControl w:val="compressPunctuation"/>
-  <w:compat>
-    <w:spaceForUL/>
-    <w:balanceSingleByteDoubleByteWidth/>
-    <w:doNotLeaveBackslashAlone/>
-    <w:ulTrailSpace/>
-    <w:doNotExpandShiftReturn/>
-    <w:adjustLineHeightInTable/>
-    <w:useFELayout/>
-    <w:compatSetting w:name="compatibilityMode" w:uri="http://schemas.microsoft.com/office/word" w:val="15"/>
-    <w:compatSetting w:name="overrideTableStyleFontSizeAndJustification" w:uri="http://schemas.microsoft.com/office/word" w:val="1"/>
-    <w:compatSetting w:name="enableOpenTypeFeatures" w:uri="http://schemas.microsoft.com/office/word" w:val="1"/>
-    <w:compatSetting w:name="doNotFlipMirrorIndents" w:uri="http://schemas.microsoft.com/office/word" w:val="1"/>
-    <w:compatSetting w:name="differentiateMultirowTableHeaders" w:uri="http://schemas.microsoft.com/office/word" w:val="1"/>
-  </w:compat>
-  <w:rsids>
-    <w:rsidRoot w:val="00AD5E14"/>
-    <w:rsid w:val="00AD5E14"/>
-  </w:rsids>
-  <m:mathPr>
-    <m:mathFont m:val="Cambria Math"/>
-    <m:brkBin m:val="before"/>
-    <m:brkBinSub m:val="--"/>
-    <m:smallFrac m:val="0"/>
-    <m:dispDef/>
-    <m:lMargin m:val="0"/>
-    <m:rMargin m:val="0"/>
-    <m:defJc m:val="centerGroup"/>
-    <m:wrapIndent m:val="1440"/>
-    <m:intLim m:val="subSup"/>
-    <m:naryLim m:val="undOvr"/>
-  </m:mathPr>
-  <w:themeFontLang w:val="en-US" w:eastAsia="zh-CN"/>
-  <w:clrSchemeMapping w:bg1="light1" w:t1="dark1" w:bg2="light2" w:t2="dark2" w:accent1="accent1" w:accent2="accent2" w:accent3="accent3" w:accent4="accent4" w:accent5="accent5" w:accent6="accent6" w:hyperlink="hyperlink" w:followedHyperlink="followedHyperlink"/>
-  <w:decimalSymbol w:val="."/>
-  <w:listSeparator w:val=","/>
-  <w15:chartTrackingRefBased/>
-</w:settings>
-</file>
-
-<file path=word/glossary/styles.xml><?xml version="1.0" encoding="utf-8"?>
-<w:styles xmlns:mc="http://schemas.openxmlformats.org/markup-compatibility/2006" xmlns:r="http://schemas.openxmlformats.org/officeDocument/2006/relationships" xmlns:w="http://schemas.openxmlformats.org/wordprocessingml/2006/main" xmlns:w14="http://schemas.microsoft.com/office/word/2010/wordml" xmlns:w15="http://schemas.microsoft.com/office/word/2012/wordml" xmlns:w16se="http://schemas.microsoft.com/office/word/2015/wordml/symex" mc:Ignorable="w14 w15 w16se">
-  <w:docDefaults>
-    <w:rPrDefault>
-      <w:rPr>
-        <w:rFonts w:asciiTheme="minorHAnsi" w:eastAsiaTheme="minorEastAsia" w:hAnsiTheme="minorHAnsi" w:cstheme="minorBidi"/>
-        <w:kern w:val="2"/>
-        <w:sz w:val="21"/>
-        <w:szCs w:val="22"/>
-        <w:lang w:val="en-US" w:eastAsia="zh-CN" w:bidi="ar-SA"/>
-      </w:rPr>
-    </w:rPrDefault>
-    <w:pPrDefault/>
-  </w:docDefaults>
-  <w:latentStyles w:defLockedState="0" w:defUIPriority="99" w:defSemiHidden="0" w:defUnhideWhenUsed="0" w:defQFormat="0" w:count="371">
-    <w:lsdException w:name="Normal" w:uiPriority="0" w:qFormat="1"/>
-    <w:lsdException w:name="heading 1" w:uiPriority="9" w:qFormat="1"/>
-    <w:lsdException w:name="heading 2" w:semiHidden="1" w:uiPriority="9" w:unhideWhenUsed="1" w:qFormat="1"/>
-    <w:lsdException w:name="heading 3" w:semiHidden="1" w:uiPriority="9" w:unhideWhenUsed="1" w:qFormat="1"/>
-    <w:lsdException w:name="heading 4" w:semiHidden="1" w:uiPriority="9" w:unhideWhenUsed="1" w:qFormat="1"/>
-    <w:lsdException w:name="heading 5" w:semiHidden="1" w:uiPriority="9" w:unhideWhenUsed="1" w:qFormat="1"/>
-    <w:lsdException w:name="heading 6" w:semiHidden="1" w:uiPriority="9" w:unhideWhenUsed="1" w:qFormat="1"/>
-    <w:lsdException w:name="heading 7" w:semiHidden="1" w:uiPriority="9" w:unhideWhenUsed="1" w:qFormat="1"/>
-    <w:lsdException w:name="heading 8" w:semiHidden="1" w:uiPriority="9" w:unhideWhenUsed="1" w:qFormat="1"/>
-    <w:lsdException w:name="heading 9" w:semiHidden="1" w:uiPriority="9" w:unhideWhenUsed="1" w:qFormat="1"/>
-    <w:lsdException w:name="index 1" w:semiHidden="1" w:unhideWhenUsed="1"/>
-    <w:lsdException w:name="index 2" w:semiHidden="1" w:unhideWhenUsed="1"/>
-    <w:lsdException w:name="index 3" w:semiHidden="1" w:unhideWhenUsed="1"/>
-    <w:lsdException w:name="index 4" w:semiHidden="1" w:unhideWhenUsed="1"/>
-    <w:lsdException w:name="index 5" w:semiHidden="1" w:unhideWhenUsed="1"/>
-    <w:lsdException w:name="index 6" w:semiHidden="1" w:unhideWhenUsed="1"/>
-    <w:lsdException w:name="index 7" w:semiHidden="1" w:unhideWhenUsed="1"/>
-    <w:lsdException w:name="index 8" w:semiHidden="1" w:unhideWhenUsed="1"/>
-    <w:lsdException w:name="index 9" w:semiHidden="1" w:unhideWhenUsed="1"/>
-    <w:lsdException w:name="toc 1" w:semiHidden="1" w:uiPriority="39" w:unhideWhenUsed="1"/>
-    <w:lsdException w:name="toc 2" w:semiHidden="1" w:uiPriority="39" w:unhideWhenUsed="1"/>
-    <w:lsdException w:name="toc 3" w:semiHidden="1" w:uiPriority="39" w:unhideWhenUsed="1"/>
-    <w:lsdException w:name="toc 4" w:semiHidden="1" w:uiPriority="39" w:unhideWhenUsed="1"/>
-    <w:lsdException w:name="toc 5" w:semiHidden="1" w:uiPriority="39" w:unhideWhenUsed="1"/>
-    <w:lsdException w:name="toc 6" w:semiHidden="1" w:uiPriority="39" w:unhideWhenUsed="1"/>
-    <w:lsdException w:name="toc 7" w:semiHidden="1" w:uiPriority="39" w:unhideWhenUsed="1"/>
-    <w:lsdException w:name="toc 8" w:semiHidden="1" w:uiPriority="39" w:unhideWhenUsed="1"/>
-    <w:lsdException w:name="toc 9" w:semiHidden="1" w:uiPriority="39" w:unhideWhenUsed="1"/>
-    <w:lsdException w:name="Normal Indent" w:semiHidden="1" w:unhideWhenUsed="1"/>
-    <w:lsdException w:name="footnote text" w:semiHidden="1" w:unhideWhenUsed="1"/>
-    <w:lsdException w:name="annotation text" w:semiHidden="1" w:unhideWhenUsed="1"/>
-    <w:lsdException w:name="header" w:semiHidden="1" w:unhideWhenUsed="1"/>
-    <w:lsdException w:name="footer" w:semiHidden="1" w:unhideWhenUsed="1"/>
-    <w:lsdException w:name="index heading" w:semiHidden="1" w:unhideWhenUsed="1"/>
-    <w:lsdException w:name="caption" w:semiHidden="1" w:uiPriority="35" w:unhideWhenUsed="1" w:qFormat="1"/>
-    <w:lsdException w:name="table of figures" w:semiHidden="1" w:unhideWhenUsed="1"/>
-    <w:lsdException w:name="envelope address" w:semiHidden="1" w:unhideWhenUsed="1"/>
-    <w:lsdException w:name="envelope return" w:semiHidden="1" w:unhideWhenUsed="1"/>
-    <w:lsdException w:name="footnote reference" w:semiHidden="1" w:unhideWhenUsed="1"/>
-    <w:lsdException w:name="annotation reference" w:semiHidden="1" w:unhideWhenUsed="1"/>
-    <w:lsdException w:name="line number" w:semiHidden="1" w:unhideWhenUsed="1"/>
-    <w:lsdException w:name="page number" w:semiHidden="1" w:unhideWhenUsed="1"/>
-    <w:lsdException w:name="endnote reference" w:semiHidden="1" w:unhideWhenUsed="1"/>
-    <w:lsdException w:name="endnote text" w:semiHidden="1" w:unhideWhenUsed="1"/>
-    <w:lsdException w:name="table of authorities" w:semiHidden="1" w:unhideWhenUsed="1"/>
-    <w:lsdException w:name="macro" w:semiHidden="1" w:unhideWhenUsed="1"/>
-    <w:lsdException w:name="toa heading" w:semiHidden="1" w:unhideWhenUsed="1"/>
-    <w:lsdException w:name="List" w:semiHidden="1" w:unhideWhenUsed="1"/>
-    <w:lsdException w:name="List Bullet" w:semiHidden="1" w:unhideWhenUsed="1"/>
-    <w:lsdException w:name="List Number" w:semiHidden="1" w:unhideWhenUsed="1"/>
-    <w:lsdException w:name="List 2" w:semiHidden="1" w:unhideWhenUsed="1"/>
-    <w:lsdException w:name="List 3" w:semiHidden="1" w:unhideWhenUsed="1"/>
-    <w:lsdException w:name="List 4" w:semiHidden="1" w:unhideWhenUsed="1"/>
-    <w:lsdException w:name="List 5" w:semiHidden="1" w:unhideWhenUsed="1"/>
-    <w:lsdException w:name="List Bullet 2" w:semiHidden="1" w:unhideWhenUsed="1"/>
-    <w:lsdException w:name="List Bullet 3" w:semiHidden="1" w:unhideWhenUsed="1"/>
-    <w:lsdException w:name="List Bullet 4" w:semiHidden="1" w:unhideWhenUsed="1"/>
-    <w:lsdException w:name="List Bullet 5" w:semiHidden="1" w:unhideWhenUsed="1"/>
-    <w:lsdException w:name="List Number 2" w:semiHidden="1" w:unhideWhenUsed="1"/>
-    <w:lsdException w:name="List Number 3" w:semiHidden="1" w:unhideWhenUsed="1"/>
-    <w:lsdException w:name="List Number 4" w:semiHidden="1" w:unhideWhenUsed="1"/>
-    <w:lsdException w:name="List Number 5" w:semiHidden="1" w:unhideWhenUsed="1"/>
-    <w:lsdException w:name="Title" w:uiPriority="10" w:qFormat="1"/>
-    <w:lsdException w:name="Closing" w:semiHidden="1" w:unhideWhenUsed="1"/>
-    <w:lsdException w:name="Signature" w:semiHidden="1" w:unhideWhenUsed="1"/>
-    <w:lsdException w:name="Default Paragraph Font" w:semiHidden="1" w:uiPriority="1" w:unhideWhenUsed="1"/>
-    <w:lsdException w:name="Body Text" w:semiHidden="1" w:unhideWhenUsed="1"/>
-    <w:lsdException w:name="Body Text Indent" w:semiHidden="1" w:unhideWhenUsed="1"/>
-    <w:lsdException w:name="List Continue" w:semiHidden="1" w:unhideWhenUsed="1"/>
-    <w:lsdException w:name="List Continue 2" w:semiHidden="1" w:unhideWhenUsed="1"/>
-    <w:lsdException w:name="List Continue 3" w:semiHidden="1" w:unhideWhenUsed="1"/>
-    <w:lsdException w:name="List Continue 4" w:semiHidden="1" w:unhideWhenUsed="1"/>
-    <w:lsdException w:name="List Continue 5" w:semiHidden="1" w:unhideWhenUsed="1"/>
-    <w:lsdException w:name="Message Header" w:semiHidden="1" w:unhideWhenUsed="1"/>
-    <w:lsdException w:name="Subtitle" w:uiPriority="11" w:qFormat="1"/>
-    <w:lsdException w:name="Salutation" w:semiHidden="1" w:unhideWhenUsed="1"/>
-    <w:lsdException w:name="Date" w:semiHidden="1" w:unhideWhenUsed="1"/>
-    <w:lsdException w:name="Body Text First Indent" w:semiHidden="1" w:unhideWhenUsed="1"/>
-    <w:lsdException w:name="Body Text First Indent 2" w:semiHidden="1" w:unhideWhenUsed="1"/>
-    <w:lsdException w:name="Note Heading" w:semiHidden="1" w:unhideWhenUsed="1"/>
-    <w:lsdException w:name="Body Text 2" w:semiHidden="1" w:unhideWhenUsed="1"/>
-    <w:lsdException w:name="Body Text 3" w:semiHidden="1" w:unhideWhenUsed="1"/>
-    <w:lsdException w:name="Body Text Indent 2" w:semiHidden="1" w:unhideWhenUsed="1"/>
-    <w:lsdException w:name="Body Text Indent 3" w:semiHidden="1" w:unhideWhenUsed="1"/>
-    <w:lsdException w:name="Block Text" w:semiHidden="1" w:unhideWhenUsed="1"/>
-    <w:lsdException w:name="Hyperlink" w:semiHidden="1" w:unhideWhenUsed="1"/>
-    <w:lsdException w:name="FollowedHyperlink" w:semiHidden="1" w:unhideWhenUsed="1"/>
-    <w:lsdException w:name="Strong" w:uiPriority="22" w:qFormat="1"/>
-    <w:lsdException w:name="Emphasis" w:uiPriority="20" w:qFormat="1"/>
-    <w:lsdException w:name="Document Map" w:semiHidden="1" w:unhideWhenUsed="1"/>
-    <w:lsdException w:name="Plain Text" w:semiHidden="1" w:unhideWhenUsed="1"/>
-    <w:lsdException w:name="E-mail Signature" w:semiHidden="1" w:unhideWhenUsed="1"/>
-    <w:lsdException w:name="HTML Top of Form" w:semiHidden="1" w:unhideWhenUsed="1"/>
-    <w:lsdException w:name="HTML Bottom of Form" w:semiHidden="1" w:unhideWhenUsed="1"/>
-    <w:lsdException w:name="Normal (Web)" w:semiHidden="1" w:unhideWhenUsed="1"/>
-    <w:lsdException w:name="HTML Acronym" w:semiHidden="1" w:unhideWhenUsed="1"/>
-    <w:lsdException w:name="HTML Address" w:semiHidden="1" w:unhideWhenUsed="1"/>
-    <w:lsdException w:name="HTML Cite" w:semiHidden="1" w:unhideWhenUsed="1"/>
-    <w:lsdException w:name="HTML Code" w:semiHidden="1" w:unhideWhenUsed="1"/>
-    <w:lsdException w:name="HTML Definition" w:semiHidden="1" w:unhideWhenUsed="1"/>
-    <w:lsdException w:name="HTML Keyboard" w:semiHidden="1" w:unhideWhenUsed="1"/>
-    <w:lsdException w:name="HTML Preformatted" w:semiHidden="1" w:unhideWhenUsed="1"/>
-    <w:lsdException w:name="HTML Sample" w:semiHidden="1" w:unhideWhenUsed="1"/>
-    <w:lsdException w:name="HTML Typewriter" w:semiHidden="1" w:unhideWhenUsed="1"/>
-    <w:lsdException w:name="HTML Variable" w:semiHidden="1" w:unhideWhenUsed="1"/>
-    <w:lsdException w:name="Normal Table" w:semiHidden="1" w:unhideWhenUsed="1"/>
-    <w:lsdException w:name="annotation subject" w:semiHidden="1" w:unhideWhenUsed="1"/>
-    <w:lsdException w:name="No List" w:semiHidden="1" w:unhideWhenUsed="1"/>
-    <w:lsdException w:name="Outline List 1" w:semiHidden="1" w:unhideWhenUsed="1"/>
-    <w:lsdException w:name="Outline List 2" w:semiHidden="1" w:unhideWhenUsed="1"/>
-    <w:lsdException w:name="Outline List 3" w:semiHidden="1" w:unhideWhenUsed="1"/>
-    <w:lsdException w:name="Table Simple 1" w:semiHidden="1" w:unhideWhenUsed="1"/>
-    <w:lsdException w:name="Table Simple 2" w:semiHidden="1" w:unhideWhenUsed="1"/>
-    <w:lsdException w:name="Table Simple 3" w:semiHidden="1" w:unhideWhenUsed="1"/>
-    <w:lsdException w:name="Table Classic 1" w:semiHidden="1" w:unhideWhenUsed="1"/>
-    <w:lsdException w:name="Table Classic 2" w:semiHidden="1" w:unhideWhenUsed="1"/>
-    <w:lsdException w:name="Table Classic 3" w:semiHidden="1" w:unhideWhenUsed="1"/>
-    <w:lsdException w:name="Table Classic 4" w:semiHidden="1" w:unhideWhenUsed="1"/>
-    <w:lsdException w:name="Table Colorful 1" w:semiHidden="1" w:unhideWhenUsed="1"/>
-    <w:lsdException w:name="Table Colorful 2" w:semiHidden="1" w:unhideWhenUsed="1"/>
-    <w:lsdException w:name="Table Colorful 3" w:semiHidden="1" w:unhideWhenUsed="1"/>
-    <w:lsdException w:name="Table Columns 1" w:semiHidden="1" w:unhideWhenUsed="1"/>
-    <w:lsdException w:name="Table Columns 2" w:semiHidden="1" w:unhideWhenUsed="1"/>
-    <w:lsdException w:name="Table Columns 3" w:semiHidden="1" w:unhideWhenUsed="1"/>
-    <w:lsdException w:name="Table Columns 4" w:semiHidden="1" w:unhideWhenUsed="1"/>
-    <w:lsdException w:name="Table Columns 5" w:semiHidden="1" w:unhideWhenUsed="1"/>
-    <w:lsdException w:name="Table Grid 1" w:semiHidden="1" w:unhideWhenUsed="1"/>
-    <w:lsdException w:name="Table Grid 2" w:semiHidden="1" w:unhideWhenUsed="1"/>
-    <w:lsdException w:name="Table Grid 3" w:semiHidden="1" w:unhideWhenUsed="1"/>
-    <w:lsdException w:name="Table Grid 4" w:semiHidden="1" w:unhideWhenUsed="1"/>
-    <w:lsdException w:name="Table Grid 5" w:semiHidden="1" w:unhideWhenUsed="1"/>
-    <w:lsdException w:name="Table Grid 6" w:semiHidden="1" w:unhideWhenUsed="1"/>
-    <w:lsdException w:name="Table Grid 7" w:semiHidden="1" w:unhideWhenUsed="1"/>
-    <w:lsdException w:name="Table Grid 8" w:semiHidden="1" w:unhideWhenUsed="1"/>
-    <w:lsdException w:name="Table List 1" w:semiHidden="1" w:unhideWhenUsed="1"/>
-    <w:lsdException w:name="Table List 2" w:semiHidden="1" w:unhideWhenUsed="1"/>
-    <w:lsdException w:name="Table List 3" w:semiHidden="1" w:unhideWhenUsed="1"/>
-    <w:lsdException w:name="Table List 4" w:semiHidden="1" w:unhideWhenUsed="1"/>
-    <w:lsdException w:name="Table List 5" w:semiHidden="1" w:unhideWhenUsed="1"/>
-    <w:lsdException w:name="Table List 6" w:semiHidden="1" w:unhideWhenUsed="1"/>
-    <w:lsdException w:name="Table List 7" w:semiHidden="1" w:unhideWhenUsed="1"/>
-    <w:lsdException w:name="Table List 8" w:semiHidden="1" w:unhideWhenUsed="1"/>
-    <w:lsdException w:name="Table 3D effects 1" w:semiHidden="1" w:unhideWhenUsed="1"/>
-    <w:lsdException w:name="Table 3D effects 2" w:semiHidden="1" w:unhideWhenUsed="1"/>
-    <w:lsdException w:name="Table 3D effects 3" w:semiHidden="1" w:unhideWhenUsed="1"/>
-    <w:lsdException w:name="Table Contemporary" w:semiHidden="1" w:unhideWhenUsed="1"/>
-    <w:lsdException w:name="Table Elegant" w:semiHidden="1" w:unhideWhenUsed="1"/>
-    <w:lsdException w:name="Table Professional" w:semiHidden="1" w:unhideWhenUsed="1"/>
-    <w:lsdException w:name="Table Subtle 1" w:semiHidden="1" w:unhideWhenUsed="1"/>
-    <w:lsdException w:name="Table Subtle 2" w:semiHidden="1" w:unhideWhenUsed="1"/>
-    <w:lsdException w:name="Table Web 1" w:semiHidden="1" w:unhideWhenUsed="1"/>
-    <w:lsdException w:name="Table Web 2" w:semiHidden="1" w:unhideWhenUsed="1"/>
-    <w:lsdException w:name="Table Web 3" w:semiHidden="1" w:unhideWhenUsed="1"/>
-    <w:lsdException w:name="Balloon Text" w:semiHidden="1" w:unhideWhenUsed="1"/>
-    <w:lsdException w:name="Table Grid" w:uiPriority="39"/>
-    <w:lsdException w:name="Table Theme" w:semiHidden="1" w:unhideWhenUsed="1"/>
-    <w:lsdException w:name="Placeholder Text" w:semiHidden="1"/>
-    <w:lsdException w:name="No Spacing" w:uiPriority="1" w:qFormat="1"/>
-    <w:lsdException w:name="Light Shading" w:uiPriority="60"/>
-    <w:lsdException w:name="Light List" w:uiPriority="61"/>
-    <w:lsdException w:name="Light Grid" w:uiPriority="62"/>
-    <w:lsdException w:name="Medium Shading 1" w:uiPriority="63"/>
-    <w:lsdException w:name="Medium Shading 2" w:uiPriority="64"/>
-    <w:lsdException w:name="Medium List 1" w:uiPriority="65"/>
-    <w:lsdException w:name="Medium List 2" w:uiPriority="66"/>
-    <w:lsdException w:name="Medium Grid 1" w:uiPriority="67"/>
-    <w:lsdException w:name="Medium Grid 2" w:uiPriority="68"/>
-    <w:lsdException w:name="Medium Grid 3" w:uiPriority="69"/>
-    <w:lsdException w:name="Dark List" w:uiPriority="70"/>
-    <w:lsdException w:name="Colorful Shading" w:uiPriority="71"/>
-    <w:lsdException w:name="Colorful List" w:uiPriority="72"/>
-    <w:lsdException w:name="Colorful Grid" w:uiPriority="73"/>
-    <w:lsdException w:name="Light Shading Accent 1" w:uiPriority="60"/>
-    <w:lsdException w:name="Light List Accent 1" w:uiPriority="61"/>
-    <w:lsdException w:name="Light Grid Accent 1" w:uiPriority="62"/>
-    <w:lsdException w:name="Medium Shading 1 Accent 1" w:uiPriority="63"/>
-    <w:lsdException w:name="Medium Shading 2 Accent 1" w:uiPriority="64"/>
-    <w:lsdException w:name="Medium List 1 Accent 1" w:uiPriority="65"/>
-    <w:lsdException w:name="Revision" w:semiHidden="1"/>
-    <w:lsdException w:name="List Paragraph" w:uiPriority="34" w:qFormat="1"/>
-    <w:lsdException w:name="Quote" w:uiPriority="29" w:qFormat="1"/>
-    <w:lsdException w:name="Intense Quote" w:uiPriority="30" w:qFormat="1"/>
-    <w:lsdException w:name="Medium List 2 Accent 1" w:uiPriority="66"/>
-    <w:lsdException w:name="Medium Grid 1 Accent 1" w:uiPriority="67"/>
-    <w:lsdException w:name="Medium Grid 2 Accent 1" w:uiPriority="68"/>
-    <w:lsdException w:name="Medium Grid 3 Accent 1" w:uiPriority="69"/>
-    <w:lsdException w:name="Dark List Accent 1" w:uiPriority="70"/>
-    <w:lsdException w:name="Colorful Shading Accent 1" w:uiPriority="71"/>
-    <w:lsdException w:name="Colorful List Accent 1" w:uiPriority="72"/>
-    <w:lsdException w:name="Colorful Grid Accent 1" w:uiPriority="73"/>
-    <w:lsdException w:name="Light Shading Accent 2" w:uiPriority="60"/>
-    <w:lsdException w:name="Light List Accent 2" w:uiPriority="61"/>
-    <w:lsdException w:name="Light Grid Accent 2" w:uiPriority="62"/>
-    <w:lsdException w:name="Medium Shading 1 Accent 2" w:uiPriority="63"/>
-    <w:lsdException w:name="Medium Shading 2 Accent 2" w:uiPriority="64"/>
-    <w:lsdException w:name="Medium List 1 Accent 2" w:uiPriority="65"/>
-    <w:lsdException w:name="Medium List 2 Accent 2" w:uiPriority="66"/>
-    <w:lsdException w:name="Medium Grid 1 Accent 2" w:uiPriority="67"/>
-    <w:lsdException w:name="Medium Grid 2 Accent 2" w:uiPriority="68"/>
-    <w:lsdException w:name="Medium Grid 3 Accent 2" w:uiPriority="69"/>
-    <w:lsdException w:name="Dark List Accent 2" w:uiPriority="70"/>
-    <w:lsdException w:name="Colorful Shading Accent 2" w:uiPriority="71"/>
-    <w:lsdException w:name="Colorful List Accent 2" w:uiPriority="72"/>
-    <w:lsdException w:name="Colorful Grid Accent 2" w:uiPriority="73"/>
-    <w:lsdException w:name="Light Shading Accent 3" w:uiPriority="60"/>
-    <w:lsdException w:name="Light List Accent 3" w:uiPriority="61"/>
-    <w:lsdException w:name="Light Grid Accent 3" w:uiPriority="62"/>
-    <w:lsdException w:name="Medium Shading 1 Accent 3" w:uiPriority="63"/>
-    <w:lsdException w:name="Medium Shading 2 Accent 3" w:uiPriority="64"/>
-    <w:lsdException w:name="Medium List 1 Accent 3" w:uiPriority="65"/>
-    <w:lsdException w:name="Medium List 2 Accent 3" w:uiPriority="66"/>
-    <w:lsdException w:name="Medium Grid 1 Accent 3" w:uiPriority="67"/>
-    <w:lsdException w:name="Medium Grid 2 Accent 3" w:uiPriority="68"/>
-    <w:lsdException w:name="Medium Grid 3 Accent 3" w:uiPriority="69"/>
-    <w:lsdException w:name="Dark List Accent 3" w:uiPriority="70"/>
-    <w:lsdException w:name="Colorful Shading Accent 3" w:uiPriority="71"/>
-    <w:lsdException w:name="Colorful List Accent 3" w:uiPriority="72"/>
-    <w:lsdException w:name="Colorful Grid Accent 3" w:uiPriority="73"/>
-    <w:lsdException w:name="Light Shading Accent 4" w:uiPriority="60"/>
-    <w:lsdException w:name="Light List Accent 4" w:uiPriority="61"/>
-    <w:lsdException w:name="Light Grid Accent 4" w:uiPriority="62"/>
-    <w:lsdException w:name="Medium Shading 1 Accent 4" w:uiPriority="63"/>
-    <w:lsdException w:name="Medium Shading 2 Accent 4" w:uiPriority="64"/>
-    <w:lsdException w:name="Medium List 1 Accent 4" w:uiPriority="65"/>
-    <w:lsdException w:name="Medium List 2 Accent 4" w:uiPriority="66"/>
-    <w:lsdException w:name="Medium Grid 1 Accent 4" w:uiPriority="67"/>
-    <w:lsdException w:name="Medium Grid 2 Accent 4" w:uiPriority="68"/>
-    <w:lsdException w:name="Medium Grid 3 Accent 4" w:uiPriority="69"/>
-    <w:lsdException w:name="Dark List Accent 4" w:uiPriority="70"/>
-    <w:lsdException w:name="Colorful Shading Accent 4" w:uiPriority="71"/>
-    <w:lsdException w:name="Colorful List Accent 4" w:uiPriority="72"/>
-    <w:lsdException w:name="Colorful Grid Accent 4" w:uiPriority="73"/>
-    <w:lsdException w:name="Light Shading Accent 5" w:uiPriority="60"/>
-    <w:lsdException w:name="Light List Accent 5" w:uiPriority="61"/>
-    <w:lsdException w:name="Light Grid Accent 5" w:uiPriority="62"/>
-    <w:lsdException w:name="Medium Shading 1 Accent 5" w:uiPriority="63"/>
-    <w:lsdException w:name="Medium Shading 2 Accent 5" w:uiPriority="64"/>
-    <w:lsdException w:name="Medium List 1 Accent 5" w:uiPriority="65"/>
-    <w:lsdException w:name="Medium List 2 Accent 5" w:uiPriority="66"/>
-    <w:lsdException w:name="Medium Grid 1 Accent 5" w:uiPriority="67"/>
-    <w:lsdException w:name="Medium Grid 2 Accent 5" w:uiPriority="68"/>
-    <w:lsdException w:name="Medium Grid 3 Accent 5" w:uiPriority="69"/>
-    <w:lsdException w:name="Dark List Accent 5" w:uiPriority="70"/>
-    <w:lsdException w:name="Colorful Shading Accent 5" w:uiPriority="71"/>
-    <w:lsdException w:name="Colorful List Accent 5" w:uiPriority="72"/>
-    <w:lsdException w:name="Colorful Grid Accent 5" w:uiPriority="73"/>
-    <w:lsdException w:name="Light Shading Accent 6" w:uiPriority="60"/>
-    <w:lsdException w:name="Light List Accent 6" w:uiPriority="61"/>
-    <w:lsdException w:name="Light Grid Accent 6" w:uiPriority="62"/>
-    <w:lsdException w:name="Medium Shading 1 Accent 6" w:uiPriority="63"/>
-    <w:lsdException w:name="Medium Shading 2 Accent 6" w:uiPriority="64"/>
-    <w:lsdException w:name="Medium List 1 Accent 6" w:uiPriority="65"/>
-    <w:lsdException w:name="Medium List 2 Accent 6" w:uiPriority="66"/>
-    <w:lsdException w:name="Medium Grid 1 Accent 6" w:uiPriority="67"/>
-    <w:lsdException w:name="Medium Grid 2 Accent 6" w:uiPriority="68"/>
-    <w:lsdException w:name="Medium Grid 3 Accent 6" w:uiPriority="69"/>
-    <w:lsdException w:name="Dark List Accent 6" w:uiPriority="70"/>
-    <w:lsdException w:name="Colorful Shading Accent 6" w:uiPriority="71"/>
-    <w:lsdException w:name="Colorful List Accent 6" w:uiPriority="72"/>
-    <w:lsdException w:name="Colorful Grid Accent 6" w:uiPriority="73"/>
-    <w:lsdException w:name="Subtle Emphasis" w:uiPriority="19" w:qFormat="1"/>
-    <w:lsdException w:name="Intense Emphasis" w:uiPriority="21" w:qFormat="1"/>
-    <w:lsdException w:name="Subtle Reference" w:uiPriority="31" w:qFormat="1"/>
-    <w:lsdException w:name="Intense Reference" w:uiPriority="32" w:qFormat="1"/>
-    <w:lsdException w:name="Book Title" w:uiPriority="33" w:qFormat="1"/>
-    <w:lsdException w:name="Bibliography" w:semiHidden="1" w:uiPriority="37" w:unhideWhenUsed="1"/>
-    <w:lsdException w:name="TOC Heading" w:semiHidden="1" w:uiPriority="39" w:unhideWhenUsed="1" w:qFormat="1"/>
-    <w:lsdException w:name="Plain Table 1" w:uiPriority="41"/>
-    <w:lsdException w:name="Plain Table 2" w:uiPriority="42"/>
-    <w:lsdException w:name="Plain Table 3" w:uiPriority="43"/>
-    <w:lsdException w:name="Plain Table 4" w:uiPriority="44"/>
-    <w:lsdException w:name="Plain Table 5" w:uiPriority="45"/>
-    <w:lsdException w:name="Grid Table Light" w:uiPriority="40"/>
-    <w:lsdException w:name="Grid Table 1 Light" w:uiPriority="46"/>
-    <w:lsdException w:name="Grid Table 2" w:uiPriority="47"/>
-    <w:lsdException w:name="Grid Table 3" w:uiPriority="48"/>
-    <w:lsdException w:name="Grid Table 4" w:uiPriority="49"/>
-    <w:lsdException w:name="Grid Table 5 Dark" w:uiPriority="50"/>
-    <w:lsdException w:name="Grid Table 6 Colorful" w:uiPriority="51"/>
-    <w:lsdException w:name="Grid Table 7 Colorful" w:uiPriority="52"/>
-    <w:lsdException w:name="Grid Table 1 Light Accent 1" w:uiPriority="46"/>
-    <w:lsdException w:name="Grid Table 2 Accent 1" w:uiPriority="47"/>
-    <w:lsdException w:name="Grid Table 3 Accent 1" w:uiPriority="48"/>
-    <w:lsdException w:name="Grid Table 4 Accent 1" w:uiPriority="49"/>
-    <w:lsdException w:name="Grid Table 5 Dark Accent 1" w:uiPriority="50"/>
-    <w:lsdException w:name="Grid Table 6 Colorful Accent 1" w:uiPriority="51"/>
-    <w:lsdException w:name="Grid Table 7 Colorful Accent 1" w:uiPriority="52"/>
-    <w:lsdException w:name="Grid Table 1 Light Accent 2" w:uiPriority="46"/>
-    <w:lsdException w:name="Grid Table 2 Accent 2" w:uiPriority="47"/>
-    <w:lsdException w:name="Grid Table 3 Accent 2" w:uiPriority="48"/>
-    <w:lsdException w:name="Grid Table 4 Accent 2" w:uiPriority="49"/>
-    <w:lsdException w:name="Grid Table 5 Dark Accent 2" w:uiPriority="50"/>
-    <w:lsdException w:name="Grid Table 6 Colorful Accent 2" w:uiPriority="51"/>
-    <w:lsdException w:name="Grid Table 7 Colorful Accent 2" w:uiPriority="52"/>
-    <w:lsdException w:name="Grid Table 1 Light Accent 3" w:uiPriority="46"/>
-    <w:lsdException w:name="Grid Table 2 Accent 3" w:uiPriority="47"/>
-    <w:lsdException w:name="Grid Table 3 Accent 3" w:uiPriority="48"/>
-    <w:lsdException w:name="Grid Table 4 Accent 3" w:uiPriority="49"/>
-    <w:lsdException w:name="Grid Table 5 Dark Accent 3" w:uiPriority="50"/>
-    <w:lsdException w:name="Grid Table 6 Colorful Accent 3" w:uiPriority="51"/>
-    <w:lsdException w:name="Grid Table 7 Colorful Accent 3" w:uiPriority="52"/>
-    <w:lsdException w:name="Grid Table 1 Light Accent 4" w:uiPriority="46"/>
-    <w:lsdException w:name="Grid Table 2 Accent 4" w:uiPriority="47"/>
-    <w:lsdException w:name="Grid Table 3 Accent 4" w:uiPriority="48"/>
-    <w:lsdException w:name="Grid Table 4 Accent 4" w:uiPriority="49"/>
-    <w:lsdException w:name="Grid Table 5 Dark Accent 4" w:uiPriority="50"/>
-    <w:lsdException w:name="Grid Table 6 Colorful Accent 4" w:uiPriority="51"/>
-    <w:lsdException w:name="Grid Table 7 Colorful Accent 4" w:uiPriority="52"/>
-    <w:lsdException w:name="Grid Table 1 Light Accent 5" w:uiPriority="46"/>
-    <w:lsdException w:name="Grid Table 2 Accent 5" w:uiPriority="47"/>
-    <w:lsdException w:name="Grid Table 3 Accent 5" w:uiPriority="48"/>
-    <w:lsdException w:name="Grid Table 4 Accent 5" w:uiPriority="49"/>
-    <w:lsdException w:name="Grid Table 5 Dark Accent 5" w:uiPriority="50"/>
-    <w:lsdException w:name="Grid Table 6 Colorful Accent 5" w:uiPriority="51"/>
-    <w:lsdException w:name="Grid Table 7 Colorful Accent 5" w:uiPriority="52"/>
-    <w:lsdException w:name="Grid Table 1 Light Accent 6" w:uiPriority="46"/>
-    <w:lsdException w:name="Grid Table 2 Accent 6" w:uiPriority="47"/>
-    <w:lsdException w:name="Grid Table 3 Accent 6" w:uiPriority="48"/>
-    <w:lsdException w:name="Grid Table 4 Accent 6" w:uiPriority="49"/>
-    <w:lsdException w:name="Grid Table 5 Dark Accent 6" w:uiPriority="50"/>
-    <w:lsdException w:name="Grid Table 6 Colorful Accent 6" w:uiPriority="51"/>
-    <w:lsdException w:name="Grid Table 7 Colorful Accent 6" w:uiPriority="52"/>
-    <w:lsdException w:name="List Table 1 Light" w:uiPriority="46"/>
-    <w:lsdException w:name="List Table 2" w:uiPriority="47"/>
-    <w:lsdException w:name="List Table 3" w:uiPriority="48"/>
-    <w:lsdException w:name="List Table 4" w:uiPriority="49"/>
-    <w:lsdException w:name="List Table 5 Dark" w:uiPriority="50"/>
-    <w:lsdException w:name="List Table 6 Colorful" w:uiPriority="51"/>
-    <w:lsdException w:name="List Table 7 Colorful" w:uiPriority="52"/>
-    <w:lsdException w:name="List Table 1 Light Accent 1" w:uiPriority="46"/>
-    <w:lsdException w:name="List Table 2 Accent 1" w:uiPriority="47"/>
-    <w:lsdException w:name="List Table 3 Accent 1" w:uiPriority="48"/>
-    <w:lsdException w:name="List Table 4 Accent 1" w:uiPriority="49"/>
-    <w:lsdException w:name="List Table 5 Dark Accent 1" w:uiPriority="50"/>
-    <w:lsdException w:name="List Table 6 Colorful Accent 1" w:uiPriority="51"/>
-    <w:lsdException w:name="List Table 7 Colorful Accent 1" w:uiPriority="52"/>
-    <w:lsdException w:name="List Table 1 Light Accent 2" w:uiPriority="46"/>
-    <w:lsdException w:name="List Table 2 Accent 2" w:uiPriority="47"/>
-    <w:lsdException w:name="List Table 3 Accent 2" w:uiPriority="48"/>
-    <w:lsdException w:name="List Table 4 Accent 2" w:uiPriority="49"/>
-    <w:lsdException w:name="List Table 5 Dark Accent 2" w:uiPriority="50"/>
-    <w:lsdException w:name="List Table 6 Colorful Accent 2" w:uiPriority="51"/>
-    <w:lsdException w:name="List Table 7 Colorful Accent 2" w:uiPriority="52"/>
-    <w:lsdException w:name="List Table 1 Light Accent 3" w:uiPriority="46"/>
-    <w:lsdException w:name="List Table 2 Accent 3" w:uiPriority="47"/>
-    <w:lsdException w:name="List Table 3 Accent 3" w:uiPriority="48"/>
-    <w:lsdException w:name="List Table 4 Accent 3" w:uiPriority="49"/>
-    <w:lsdException w:name="List Table 5 Dark Accent 3" w:uiPriority="50"/>
-    <w:lsdException w:name="List Table 6 Colorful Accent 3" w:uiPriority="51"/>
-    <w:lsdException w:name="List Table 7 Colorful Accent 3" w:uiPriority="52"/>
-    <w:lsdException w:name="List Table 1 Light Accent 4" w:uiPriority="46"/>
-    <w:lsdException w:name="List Table 2 Accent 4" w:uiPriority="47"/>
-    <w:lsdException w:name="List Table 3 Accent 4" w:uiPriority="48"/>
-    <w:lsdException w:name="List Table 4 Accent 4" w:uiPriority="49"/>
-    <w:lsdException w:name="List Table 5 Dark Accent 4" w:uiPriority="50"/>
-    <w:lsdException w:name="List Table 6 Colorful Accent 4" w:uiPriority="51"/>
-    <w:lsdException w:name="List Table 7 Colorful Accent 4" w:uiPriority="52"/>
-    <w:lsdException w:name="List Table 1 Light Accent 5" w:uiPriority="46"/>
-    <w:lsdException w:name="List Table 2 Accent 5" w:uiPriority="47"/>
-    <w:lsdException w:name="List Table 3 Accent 5" w:uiPriority="48"/>
-    <w:lsdException w:name="List Table 4 Accent 5" w:uiPriority="49"/>
-    <w:lsdException w:name="List Table 5 Dark Accent 5" w:uiPriority="50"/>
-    <w:lsdException w:name="List Table 6 Colorful Accent 5" w:uiPriority="51"/>
-    <w:lsdException w:name="List Table 7 Colorful Accent 5" w:uiPriority="52"/>
-    <w:lsdException w:name="List Table 1 Light Accent 6" w:uiPriority="46"/>
-    <w:lsdException w:name="List Table 2 Accent 6" w:uiPriority="47"/>
-    <w:lsdException w:name="List Table 3 Accent 6" w:uiPriority="48"/>
-    <w:lsdException w:name="List Table 4 Accent 6" w:uiPriority="49"/>
-    <w:lsdException w:name="List Table 5 Dark Accent 6" w:uiPriority="50"/>
-    <w:lsdException w:name="List Table 6 Colorful Accent 6" w:uiPriority="51"/>
-    <w:lsdException w:name="List Table 7 Colorful Accent 6" w:uiPriority="52"/>
-  </w:latentStyles>
-  <w:style w:type="paragraph" w:default="1" w:styleId="a">
-    <w:name w:val="Normal"/>
-    <w:qFormat/>
-    <w:pPr>
-      <w:widowControl w:val="0"/>
-      <w:jc w:val="both"/>
-    </w:pPr>
-  </w:style>
-  <w:style w:type="character" w:default="1" w:styleId="a0">
-    <w:name w:val="Default Paragraph Font"/>
-    <w:uiPriority w:val="1"/>
-    <w:semiHidden/>
-    <w:unhideWhenUsed/>
-  </w:style>
-  <w:style w:type="table" w:default="1" w:styleId="a1">
-    <w:name w:val="Normal Table"/>
-    <w:uiPriority w:val="99"/>
-    <w:semiHidden/>
-    <w:unhideWhenUsed/>
-    <w:tblPr>
-      <w:tblInd w:w="0" w:type="dxa"/>
-      <w:tblCellMar>
-        <w:top w:w="0" w:type="dxa"/>
-        <w:left w:w="108" w:type="dxa"/>
-        <w:bottom w:w="0" w:type="dxa"/>
-        <w:right w:w="108" w:type="dxa"/>
-      </w:tblCellMar>
-    </w:tblPr>
-  </w:style>
-  <w:style w:type="numbering" w:default="1" w:styleId="a2">
-    <w:name w:val="No List"/>
-    <w:uiPriority w:val="99"/>
-    <w:semiHidden/>
-    <w:unhideWhenUsed/>
-  </w:style>
-  <w:style w:type="paragraph" w:customStyle="1" w:styleId="70E733E137884EB38D17BD8DC8548700">
-    <w:name w:val="70E733E137884EB38D17BD8DC8548700"/>
-    <w:rsid w:val="00AD5E14"/>
-    <w:pPr>
-      <w:widowControl w:val="0"/>
-      <w:jc w:val="both"/>
-    </w:pPr>
-  </w:style>
-  <w:style w:type="paragraph" w:customStyle="1" w:styleId="847EDEFEDE074791B848EDB5EA4973D7">
-    <w:name w:val="847EDEFEDE074791B848EDB5EA4973D7"/>
-    <w:rsid w:val="00AD5E14"/>
-    <w:pPr>
-      <w:widowControl w:val="0"/>
-      <w:jc w:val="both"/>
-    </w:pPr>
-  </w:style>
-  <w:style w:type="paragraph" w:customStyle="1" w:styleId="BCBF683A5D934E668E754166822B73A5">
-    <w:name w:val="BCBF683A5D934E668E754166822B73A5"/>
-    <w:rsid w:val="00AD5E14"/>
-    <w:pPr>
-      <w:widowControl w:val="0"/>
-      <w:jc w:val="both"/>
-    </w:pPr>
-  </w:style>
-</w:styles>
-</file>
-
-<file path=word/glossary/webSettings.xml><?xml version="1.0" encoding="utf-8"?>
-<w:webSettings xmlns:mc="http://schemas.openxmlformats.org/markup-compatibility/2006" xmlns:r="http://schemas.openxmlformats.org/officeDocument/2006/relationships" xmlns:w="http://schemas.openxmlformats.org/wordprocessingml/2006/main" xmlns:w14="http://schemas.microsoft.com/office/word/2010/wordml" xmlns:w15="http://schemas.microsoft.com/office/word/2012/wordml" xmlns:w16se="http://schemas.microsoft.com/office/word/2015/wordml/symex" mc:Ignorable="w14 w15 w16se">
-  <w:optimizeForBrowser/>
-  <w:allowPNG/>
-</w:webSettings>
 </file>
 
 <file path=word/theme/theme1.xml><?xml version="1.0" encoding="utf-8"?>

</xml_diff>